<commit_message>
Mudança de paleta realizada, saimos de #34C759 para #1B5E20
</commit_message>
<xml_diff>
--- a/docs/The_Farmer_Edu - Documentacao Oficial do Sistema.docx
+++ b/docs/The_Farmer_Edu - Documentacao Oficial do Sistema.docx
@@ -157,7 +157,31 @@
         <w:t xml:space="preserve">Natureza do projeto: </w:t>
       </w:r>
       <w:r>
-        <w:t>desenvolvido simultaneamente pelas duas turmas, organizadas em squads mistos com liderança técnica rotativa, sem separação fixa por camada (front-end/back-end/banco de dados).</w:t>
+        <w:t xml:space="preserve">desenvolvido simultaneamente pelas duas turmas, organizadas em </w:t>
+      </w:r>
+      <w:proofErr w:type="spellStart"/>
+      <w:r>
+        <w:t>squads</w:t>
+      </w:r>
+      <w:proofErr w:type="spellEnd"/>
+      <w:r>
+        <w:t xml:space="preserve"> mistos com liderança técnica rotativa, sem separação fixa por camada (front-</w:t>
+      </w:r>
+      <w:proofErr w:type="spellStart"/>
+      <w:r>
+        <w:t>end</w:t>
+      </w:r>
+      <w:proofErr w:type="spellEnd"/>
+      <w:r>
+        <w:t>/</w:t>
+      </w:r>
+      <w:proofErr w:type="spellStart"/>
+      <w:r>
+        <w:t>back-end</w:t>
+      </w:r>
+      <w:proofErr w:type="spellEnd"/>
+      <w:r>
+        <w:t>/banco de dados).</w:t>
       </w:r>
     </w:p>
     <w:p>
@@ -424,7 +448,17 @@
         <w:t xml:space="preserve">RF12 — </w:t>
       </w:r>
       <w:r>
-        <w:t>Acesso à Fazenda (mini-jogo) a partir de um botão dedicado.</w:t>
+        <w:t>Acesso à Fazenda (</w:t>
+      </w:r>
+      <w:proofErr w:type="spellStart"/>
+      <w:proofErr w:type="gramStart"/>
+      <w:r>
+        <w:t>mini-jogo</w:t>
+      </w:r>
+      <w:proofErr w:type="spellEnd"/>
+      <w:proofErr w:type="gramEnd"/>
+      <w:r>
+        <w:t>) a partir de um botão dedicado.</w:t>
       </w:r>
     </w:p>
     <w:p>
@@ -841,7 +875,17 @@
         <w:t xml:space="preserve">RN05 — </w:t>
       </w:r>
       <w:r>
-        <w:t>A fazenda é um mini-jogo interativo, nunca uma imagem estática; evolui ou retrocede conforme o desempenho.</w:t>
+        <w:t xml:space="preserve">A fazenda é um </w:t>
+      </w:r>
+      <w:proofErr w:type="spellStart"/>
+      <w:proofErr w:type="gramStart"/>
+      <w:r>
+        <w:t>mini-jogo</w:t>
+      </w:r>
+      <w:proofErr w:type="spellEnd"/>
+      <w:proofErr w:type="gramEnd"/>
+      <w:r>
+        <w:t xml:space="preserve"> interativo, nunca uma imagem estática; evolui ou retrocede conforme o desempenho.</w:t>
       </w:r>
     </w:p>
     <w:p>
@@ -913,7 +957,15 @@
         <w:spacing w:after="120"/>
       </w:pPr>
       <w:r>
-        <w:t>PHP puro (sem framework) + PDO + MySQL/MariaDB, priorizando os fundamentos que a turma está aprendendo nesta UC.</w:t>
+        <w:t>PHP puro (sem framework) + PDO + MySQL/</w:t>
+      </w:r>
+      <w:proofErr w:type="spellStart"/>
+      <w:r>
+        <w:t>MariaDB</w:t>
+      </w:r>
+      <w:proofErr w:type="spellEnd"/>
+      <w:r>
+        <w:t>, priorizando os fundamentos que a turma está aprendendo nesta UC.</w:t>
       </w:r>
     </w:p>
     <w:p>
@@ -930,7 +982,23 @@
         <w:spacing w:after="120"/>
       </w:pPr>
       <w:r>
-        <w:t>O código é organizado em módulos verticais — cada um concentra sua parte de banco de dados, lógica PHP e views — em vez de camadas horizontais. Isso permite que cada squad seja dono de um módulo ponta a ponta, minimizando conflitos de merge entre os 56 contribuidores:</w:t>
+        <w:t xml:space="preserve">O código é organizado em módulos verticais — cada um concentra sua parte de banco de dados, lógica PHP e </w:t>
+      </w:r>
+      <w:proofErr w:type="spellStart"/>
+      <w:r>
+        <w:t>views</w:t>
+      </w:r>
+      <w:proofErr w:type="spellEnd"/>
+      <w:r>
+        <w:t xml:space="preserve"> — em vez de camadas horizontais. Isso permite que cada </w:t>
+      </w:r>
+      <w:proofErr w:type="spellStart"/>
+      <w:r>
+        <w:t>squad</w:t>
+      </w:r>
+      <w:proofErr w:type="spellEnd"/>
+      <w:r>
+        <w:t xml:space="preserve"> seja dono de um módulo ponta a ponta, minimizando conflitos de merge entre os 56 contribuidores:</w:t>
       </w:r>
     </w:p>
     <w:p>
@@ -958,35 +1026,25 @@
           <w:sz w:val="18"/>
           <w:szCs w:val="18"/>
         </w:rPr>
-        <w:t>├── core/            (roteador, conexão PDO, sessão — uso restrito)</w:t>
-      </w:r>
-    </w:p>
-    <w:p>
-      <w:pPr>
-        <w:shd w:val="clear" w:color="auto" w:fill="F2F2F2"/>
-        <w:spacing w:after="40"/>
-      </w:pPr>
+        <w:t xml:space="preserve">├── core/         </w:t>
+      </w:r>
+      <w:proofErr w:type="gramStart"/>
       <w:r>
         <w:rPr>
           <w:rFonts w:ascii="Consolas" w:eastAsia="Consolas" w:hAnsi="Consolas" w:cs="Consolas"/>
           <w:sz w:val="18"/>
           <w:szCs w:val="18"/>
         </w:rPr>
-        <w:t>└── modules/</w:t>
-      </w:r>
-    </w:p>
-    <w:p>
-      <w:pPr>
-        <w:shd w:val="clear" w:color="auto" w:fill="F2F2F2"/>
-        <w:spacing w:after="40"/>
-      </w:pPr>
+        <w:t xml:space="preserve">   (</w:t>
+      </w:r>
+      <w:proofErr w:type="gramEnd"/>
       <w:r>
         <w:rPr>
           <w:rFonts w:ascii="Consolas" w:eastAsia="Consolas" w:hAnsi="Consolas" w:cs="Consolas"/>
           <w:sz w:val="18"/>
           <w:szCs w:val="18"/>
         </w:rPr>
-        <w:t xml:space="preserve">    ├── auth — autenticação e sessão dos dois perfis</w:t>
+        <w:t>roteador, conexão PDO, sessão — uso restrito)</w:t>
       </w:r>
     </w:p>
     <w:p>
@@ -1000,7 +1058,7 @@
           <w:sz w:val="18"/>
           <w:szCs w:val="18"/>
         </w:rPr>
-        <w:t xml:space="preserve">    ├── turmas_cursos — CRUD de curso, turma e matrícula</w:t>
+        <w:t>└── modules/</w:t>
       </w:r>
     </w:p>
     <w:p>
@@ -1014,35 +1072,25 @@
           <w:sz w:val="18"/>
           <w:szCs w:val="18"/>
         </w:rPr>
-        <w:t xml:space="preserve">    ├── atividades — CRUD de atividades (instrutor)</w:t>
-      </w:r>
-    </w:p>
-    <w:p>
-      <w:pPr>
-        <w:shd w:val="clear" w:color="auto" w:fill="F2F2F2"/>
-        <w:spacing w:after="40"/>
-      </w:pPr>
+        <w:t xml:space="preserve">    ├── </w:t>
+      </w:r>
+      <w:proofErr w:type="spellStart"/>
       <w:r>
         <w:rPr>
           <w:rFonts w:ascii="Consolas" w:eastAsia="Consolas" w:hAnsi="Consolas" w:cs="Consolas"/>
           <w:sz w:val="18"/>
           <w:szCs w:val="18"/>
         </w:rPr>
-        <w:t xml:space="preserve">    ├── submissoes — envio da resposta do aluno e integração com o Judge0</w:t>
-      </w:r>
-    </w:p>
-    <w:p>
-      <w:pPr>
-        <w:shd w:val="clear" w:color="auto" w:fill="F2F2F2"/>
-        <w:spacing w:after="40"/>
-      </w:pPr>
+        <w:t>auth</w:t>
+      </w:r>
+      <w:proofErr w:type="spellEnd"/>
       <w:r>
         <w:rPr>
           <w:rFonts w:ascii="Consolas" w:eastAsia="Consolas" w:hAnsi="Consolas" w:cs="Consolas"/>
           <w:sz w:val="18"/>
           <w:szCs w:val="18"/>
         </w:rPr>
-        <w:t xml:space="preserve">    ├── feedback_ia — geração de feedback e nota sugerida via IA</w:t>
+        <w:t xml:space="preserve"> — autenticação e sessão dos dois perfis</w:t>
       </w:r>
     </w:p>
     <w:p>
@@ -1056,35 +1104,25 @@
           <w:sz w:val="18"/>
           <w:szCs w:val="18"/>
         </w:rPr>
-        <w:t xml:space="preserve">    ├── notas — atribuição e consulta de notas</w:t>
-      </w:r>
-    </w:p>
-    <w:p>
-      <w:pPr>
-        <w:shd w:val="clear" w:color="auto" w:fill="F2F2F2"/>
-        <w:spacing w:after="40"/>
-      </w:pPr>
+        <w:t xml:space="preserve">    ├── </w:t>
+      </w:r>
+      <w:proofErr w:type="spellStart"/>
       <w:r>
         <w:rPr>
           <w:rFonts w:ascii="Consolas" w:eastAsia="Consolas" w:hAnsi="Consolas" w:cs="Consolas"/>
           <w:sz w:val="18"/>
           <w:szCs w:val="18"/>
         </w:rPr>
-        <w:t xml:space="preserve">    ├── gamificacao — motor de regras de XP</w:t>
-      </w:r>
-    </w:p>
-    <w:p>
-      <w:pPr>
-        <w:shd w:val="clear" w:color="auto" w:fill="F2F2F2"/>
-        <w:spacing w:after="40"/>
-      </w:pPr>
+        <w:t>turmas_cursos</w:t>
+      </w:r>
+      <w:proofErr w:type="spellEnd"/>
       <w:r>
         <w:rPr>
           <w:rFonts w:ascii="Consolas" w:eastAsia="Consolas" w:hAnsi="Consolas" w:cs="Consolas"/>
           <w:sz w:val="18"/>
           <w:szCs w:val="18"/>
         </w:rPr>
-        <w:t xml:space="preserve">    ├── fazenda — mini-jogo e seus estados visuais</w:t>
+        <w:t xml:space="preserve"> — CRUD de curso, turma e matrícula</w:t>
       </w:r>
     </w:p>
     <w:p>
@@ -1098,7 +1136,183 @@
           <w:sz w:val="18"/>
           <w:szCs w:val="18"/>
         </w:rPr>
-        <w:t xml:space="preserve">    ├── notificacoes — avisos de atividade pendente/nota</w:t>
+        <w:t xml:space="preserve">    ├── atividades — CRUD de atividades (instrutor)</w:t>
+      </w:r>
+    </w:p>
+    <w:p>
+      <w:pPr>
+        <w:shd w:val="clear" w:color="auto" w:fill="F2F2F2"/>
+        <w:spacing w:after="40"/>
+      </w:pPr>
+      <w:r>
+        <w:rPr>
+          <w:rFonts w:ascii="Consolas" w:eastAsia="Consolas" w:hAnsi="Consolas" w:cs="Consolas"/>
+          <w:sz w:val="18"/>
+          <w:szCs w:val="18"/>
+        </w:rPr>
+        <w:t xml:space="preserve">    ├── </w:t>
+      </w:r>
+      <w:proofErr w:type="spellStart"/>
+      <w:r>
+        <w:rPr>
+          <w:rFonts w:ascii="Consolas" w:eastAsia="Consolas" w:hAnsi="Consolas" w:cs="Consolas"/>
+          <w:sz w:val="18"/>
+          <w:szCs w:val="18"/>
+        </w:rPr>
+        <w:t>submissoes</w:t>
+      </w:r>
+      <w:proofErr w:type="spellEnd"/>
+      <w:r>
+        <w:rPr>
+          <w:rFonts w:ascii="Consolas" w:eastAsia="Consolas" w:hAnsi="Consolas" w:cs="Consolas"/>
+          <w:sz w:val="18"/>
+          <w:szCs w:val="18"/>
+        </w:rPr>
+        <w:t xml:space="preserve"> — envio da resposta do aluno e integração com o Judge0</w:t>
+      </w:r>
+    </w:p>
+    <w:p>
+      <w:pPr>
+        <w:shd w:val="clear" w:color="auto" w:fill="F2F2F2"/>
+        <w:spacing w:after="40"/>
+      </w:pPr>
+      <w:r>
+        <w:rPr>
+          <w:rFonts w:ascii="Consolas" w:eastAsia="Consolas" w:hAnsi="Consolas" w:cs="Consolas"/>
+          <w:sz w:val="18"/>
+          <w:szCs w:val="18"/>
+        </w:rPr>
+        <w:t xml:space="preserve">    ├── </w:t>
+      </w:r>
+      <w:proofErr w:type="spellStart"/>
+      <w:r>
+        <w:rPr>
+          <w:rFonts w:ascii="Consolas" w:eastAsia="Consolas" w:hAnsi="Consolas" w:cs="Consolas"/>
+          <w:sz w:val="18"/>
+          <w:szCs w:val="18"/>
+        </w:rPr>
+        <w:t>feedback_ia</w:t>
+      </w:r>
+      <w:proofErr w:type="spellEnd"/>
+      <w:r>
+        <w:rPr>
+          <w:rFonts w:ascii="Consolas" w:eastAsia="Consolas" w:hAnsi="Consolas" w:cs="Consolas"/>
+          <w:sz w:val="18"/>
+          <w:szCs w:val="18"/>
+        </w:rPr>
+        <w:t xml:space="preserve"> — geração de feedback e nota sugerida via IA</w:t>
+      </w:r>
+    </w:p>
+    <w:p>
+      <w:pPr>
+        <w:shd w:val="clear" w:color="auto" w:fill="F2F2F2"/>
+        <w:spacing w:after="40"/>
+      </w:pPr>
+      <w:r>
+        <w:rPr>
+          <w:rFonts w:ascii="Consolas" w:eastAsia="Consolas" w:hAnsi="Consolas" w:cs="Consolas"/>
+          <w:sz w:val="18"/>
+          <w:szCs w:val="18"/>
+        </w:rPr>
+        <w:t xml:space="preserve">    ├── notas — atribuição e consulta de notas</w:t>
+      </w:r>
+    </w:p>
+    <w:p>
+      <w:pPr>
+        <w:shd w:val="clear" w:color="auto" w:fill="F2F2F2"/>
+        <w:spacing w:after="40"/>
+      </w:pPr>
+      <w:r>
+        <w:rPr>
+          <w:rFonts w:ascii="Consolas" w:eastAsia="Consolas" w:hAnsi="Consolas" w:cs="Consolas"/>
+          <w:sz w:val="18"/>
+          <w:szCs w:val="18"/>
+        </w:rPr>
+        <w:t xml:space="preserve">    ├── </w:t>
+      </w:r>
+      <w:proofErr w:type="spellStart"/>
+      <w:r>
+        <w:rPr>
+          <w:rFonts w:ascii="Consolas" w:eastAsia="Consolas" w:hAnsi="Consolas" w:cs="Consolas"/>
+          <w:sz w:val="18"/>
+          <w:szCs w:val="18"/>
+        </w:rPr>
+        <w:t>gamificacao</w:t>
+      </w:r>
+      <w:proofErr w:type="spellEnd"/>
+      <w:r>
+        <w:rPr>
+          <w:rFonts w:ascii="Consolas" w:eastAsia="Consolas" w:hAnsi="Consolas" w:cs="Consolas"/>
+          <w:sz w:val="18"/>
+          <w:szCs w:val="18"/>
+        </w:rPr>
+        <w:t xml:space="preserve"> — motor de regras de XP</w:t>
+      </w:r>
+    </w:p>
+    <w:p>
+      <w:pPr>
+        <w:shd w:val="clear" w:color="auto" w:fill="F2F2F2"/>
+        <w:spacing w:after="40"/>
+      </w:pPr>
+      <w:r>
+        <w:rPr>
+          <w:rFonts w:ascii="Consolas" w:eastAsia="Consolas" w:hAnsi="Consolas" w:cs="Consolas"/>
+          <w:sz w:val="18"/>
+          <w:szCs w:val="18"/>
+        </w:rPr>
+        <w:t xml:space="preserve">    ├── fazenda — </w:t>
+      </w:r>
+      <w:proofErr w:type="spellStart"/>
+      <w:proofErr w:type="gramStart"/>
+      <w:r>
+        <w:rPr>
+          <w:rFonts w:ascii="Consolas" w:eastAsia="Consolas" w:hAnsi="Consolas" w:cs="Consolas"/>
+          <w:sz w:val="18"/>
+          <w:szCs w:val="18"/>
+        </w:rPr>
+        <w:t>mini-jogo</w:t>
+      </w:r>
+      <w:proofErr w:type="spellEnd"/>
+      <w:proofErr w:type="gramEnd"/>
+      <w:r>
+        <w:rPr>
+          <w:rFonts w:ascii="Consolas" w:eastAsia="Consolas" w:hAnsi="Consolas" w:cs="Consolas"/>
+          <w:sz w:val="18"/>
+          <w:szCs w:val="18"/>
+        </w:rPr>
+        <w:t xml:space="preserve"> e seus estados visuais</w:t>
+      </w:r>
+    </w:p>
+    <w:p>
+      <w:pPr>
+        <w:shd w:val="clear" w:color="auto" w:fill="F2F2F2"/>
+        <w:spacing w:after="40"/>
+      </w:pPr>
+      <w:r>
+        <w:rPr>
+          <w:rFonts w:ascii="Consolas" w:eastAsia="Consolas" w:hAnsi="Consolas" w:cs="Consolas"/>
+          <w:sz w:val="18"/>
+          <w:szCs w:val="18"/>
+        </w:rPr>
+        <w:t xml:space="preserve">    ├── </w:t>
+      </w:r>
+      <w:proofErr w:type="spellStart"/>
+      <w:r>
+        <w:rPr>
+          <w:rFonts w:ascii="Consolas" w:eastAsia="Consolas" w:hAnsi="Consolas" w:cs="Consolas"/>
+          <w:sz w:val="18"/>
+          <w:szCs w:val="18"/>
+        </w:rPr>
+        <w:t>notificacoes</w:t>
+      </w:r>
+      <w:proofErr w:type="spellEnd"/>
+      <w:r>
+        <w:rPr>
+          <w:rFonts w:ascii="Consolas" w:eastAsia="Consolas" w:hAnsi="Consolas" w:cs="Consolas"/>
+          <w:sz w:val="18"/>
+          <w:szCs w:val="18"/>
+        </w:rPr>
+        <w:t xml:space="preserve"> — avisos de atividade pendente/nota</w:t>
       </w:r>
     </w:p>
     <w:p>
@@ -1120,7 +1334,63 @@
         <w:spacing w:after="120"/>
       </w:pPr>
       <w:r>
-        <w:t>A execução de atividades de código é delegada ao Judge0 (open-source), que isola cada submissão via namespaces e cgroups do Linux, com limite de tempo de CPU, memória e sem acesso à rede. Pode ser self-hosted via Docker (recomendado em servidor dedicado, já que os containers rodam em modo privileged) ou usado via API hospedada (RapidAPI, com tier gratuito). Suporta PHP e mais de 60 linguagens.</w:t>
+        <w:t>A execução de atividades de código é delegada ao Judge0 (open-</w:t>
+      </w:r>
+      <w:proofErr w:type="spellStart"/>
+      <w:r>
+        <w:t>source</w:t>
+      </w:r>
+      <w:proofErr w:type="spellEnd"/>
+      <w:r>
+        <w:t xml:space="preserve">), que isola cada submissão via </w:t>
+      </w:r>
+      <w:proofErr w:type="spellStart"/>
+      <w:r>
+        <w:t>namespaces</w:t>
+      </w:r>
+      <w:proofErr w:type="spellEnd"/>
+      <w:r>
+        <w:t xml:space="preserve"> e </w:t>
+      </w:r>
+      <w:proofErr w:type="spellStart"/>
+      <w:r>
+        <w:t>cgroups</w:t>
+      </w:r>
+      <w:proofErr w:type="spellEnd"/>
+      <w:r>
+        <w:t xml:space="preserve"> do Linux, com limite de tempo de CPU, memória e sem acesso à rede. Pode ser self-</w:t>
+      </w:r>
+      <w:proofErr w:type="spellStart"/>
+      <w:r>
+        <w:t>hosted</w:t>
+      </w:r>
+      <w:proofErr w:type="spellEnd"/>
+      <w:r>
+        <w:t xml:space="preserve"> via Docker (recomendado em servidor dedicado, já que os containers rodam em modo </w:t>
+      </w:r>
+      <w:proofErr w:type="spellStart"/>
+      <w:r>
+        <w:t>privileged</w:t>
+      </w:r>
+      <w:proofErr w:type="spellEnd"/>
+      <w:r>
+        <w:t>) ou usado via API hospedada (</w:t>
+      </w:r>
+      <w:proofErr w:type="spellStart"/>
+      <w:r>
+        <w:t>RapidAPI</w:t>
+      </w:r>
+      <w:proofErr w:type="spellEnd"/>
+      <w:r>
+        <w:t xml:space="preserve">, com </w:t>
+      </w:r>
+      <w:proofErr w:type="spellStart"/>
+      <w:r>
+        <w:t>tier</w:t>
+      </w:r>
+      <w:proofErr w:type="spellEnd"/>
+      <w:r>
+        <w:t xml:space="preserve"> gratuito). Suporta PHP e mais de 60 linguagens.</w:t>
       </w:r>
     </w:p>
     <w:p>
@@ -1137,7 +1407,23 @@
         <w:spacing w:after="120"/>
       </w:pPr>
       <w:r>
-        <w:t>Feedback e nota sugerida gerados por um modelo de linguagem local (Llama 3.1 8B via Ollama), mantendo os dados dos alunos no próprio servidor. O processamento local funciona em fila (não em paralelo), por isso o feedback é tratado como assíncrono. Uma API paga (ex.: Gemini Flash) fica disponível como plano B para dias de pico ou caso o hardware local não seja suficiente.</w:t>
+        <w:t>Feedback e nota sugerida gerados por um modelo de linguagem local (</w:t>
+      </w:r>
+      <w:proofErr w:type="spellStart"/>
+      <w:r>
+        <w:t>Llama</w:t>
+      </w:r>
+      <w:proofErr w:type="spellEnd"/>
+      <w:r>
+        <w:t xml:space="preserve"> 3.1 8B via </w:t>
+      </w:r>
+      <w:proofErr w:type="spellStart"/>
+      <w:r>
+        <w:t>Ollama</w:t>
+      </w:r>
+      <w:proofErr w:type="spellEnd"/>
+      <w:r>
+        <w:t>), mantendo os dados dos alunos no próprio servidor. O processamento local funciona em fila (não em paralelo), por isso o feedback é tratado como assíncrono. Uma API paga (ex.: Gemini Flash) fica disponível como plano B para dias de pico ou caso o hardware local não seja suficiente.</w:t>
       </w:r>
     </w:p>
     <w:p>
@@ -1233,12 +1519,21 @@
         </w:numPr>
         <w:spacing w:after="100"/>
       </w:pPr>
-      <w:r>
-        <w:rPr>
-          <w:b/>
-          <w:bCs/>
-        </w:rPr>
-        <w:t xml:space="preserve">Usuario: </w:t>
+      <w:proofErr w:type="spellStart"/>
+      <w:r>
+        <w:rPr>
+          <w:b/>
+          <w:bCs/>
+        </w:rPr>
+        <w:t>Usuario</w:t>
+      </w:r>
+      <w:proofErr w:type="spellEnd"/>
+      <w:r>
+        <w:rPr>
+          <w:b/>
+          <w:bCs/>
+        </w:rPr>
+        <w:t xml:space="preserve">: </w:t>
       </w:r>
       <w:r>
         <w:t>base de autenticação para Instrutor e Aluno.</w:t>
@@ -1278,7 +1573,23 @@
           <w:b/>
           <w:bCs/>
         </w:rPr>
-        <w:t xml:space="preserve">Atividade / Submissao: </w:t>
+        <w:t xml:space="preserve">Atividade / </w:t>
+      </w:r>
+      <w:proofErr w:type="spellStart"/>
+      <w:r>
+        <w:rPr>
+          <w:b/>
+          <w:bCs/>
+        </w:rPr>
+        <w:t>Submissao</w:t>
+      </w:r>
+      <w:proofErr w:type="spellEnd"/>
+      <w:r>
+        <w:rPr>
+          <w:b/>
+          <w:bCs/>
+        </w:rPr>
+        <w:t xml:space="preserve">: </w:t>
       </w:r>
       <w:r>
         <w:t>cada atividade recebe várias submissões (uma por aluno/tentativa), cada uma com sua própria nota e feedback.</w:t>
@@ -1293,12 +1604,21 @@
         </w:numPr>
         <w:spacing w:after="100"/>
       </w:pPr>
-      <w:r>
-        <w:rPr>
-          <w:b/>
-          <w:bCs/>
-        </w:rPr>
-        <w:t xml:space="preserve">FeedbackIA / Nota: </w:t>
+      <w:proofErr w:type="spellStart"/>
+      <w:r>
+        <w:rPr>
+          <w:b/>
+          <w:bCs/>
+        </w:rPr>
+        <w:t>FeedbackIA</w:t>
+      </w:r>
+      <w:proofErr w:type="spellEnd"/>
+      <w:r>
+        <w:rPr>
+          <w:b/>
+          <w:bCs/>
+        </w:rPr>
+        <w:t xml:space="preserve"> / Nota: </w:t>
       </w:r>
       <w:r>
         <w:t>gerados a partir de uma submissão; a nota da IA é sugestão até validação do instrutor.</w:t>
@@ -1318,7 +1638,39 @@
           <w:b/>
           <w:bCs/>
         </w:rPr>
-        <w:t xml:space="preserve">Fazenda / ElementoFazenda / XPLog: </w:t>
+        <w:t xml:space="preserve">Fazenda / </w:t>
+      </w:r>
+      <w:proofErr w:type="spellStart"/>
+      <w:r>
+        <w:rPr>
+          <w:b/>
+          <w:bCs/>
+        </w:rPr>
+        <w:t>ElementoFazenda</w:t>
+      </w:r>
+      <w:proofErr w:type="spellEnd"/>
+      <w:r>
+        <w:rPr>
+          <w:b/>
+          <w:bCs/>
+        </w:rPr>
+        <w:t xml:space="preserve"> / </w:t>
+      </w:r>
+      <w:proofErr w:type="spellStart"/>
+      <w:r>
+        <w:rPr>
+          <w:b/>
+          <w:bCs/>
+        </w:rPr>
+        <w:t>XPLog</w:t>
+      </w:r>
+      <w:proofErr w:type="spellEnd"/>
+      <w:r>
+        <w:rPr>
+          <w:b/>
+          <w:bCs/>
+        </w:rPr>
+        <w:t xml:space="preserve">: </w:t>
       </w:r>
       <w:r>
         <w:t>representam a gamificação — o estado da fazenda e seus elementos evoluem conforme o XP acumulado pelo aluno.</w:t>
@@ -1345,6 +1697,9 @@
         <w:jc w:val="center"/>
       </w:pPr>
       <w:r>
+        <w:rPr>
+          <w:noProof/>
+        </w:rPr>
         <w:drawing>
           <wp:inline distT="0" distB="0" distL="0" distR="0" wp14:anchorId="6477EADD" wp14:editId="56834616">
             <wp:extent cx="5731510" cy="6510655"/>
@@ -1456,12 +1811,6 @@
         <w:gridCol w:w="4200"/>
       </w:tblGrid>
       <w:tr>
-        <w:tblPrEx>
-          <w:tblCellMar>
-            <w:top w:w="0" w:type="dxa"/>
-            <w:bottom w:w="0" w:type="dxa"/>
-          </w:tblCellMar>
-        </w:tblPrEx>
         <w:tc>
           <w:tcPr>
             <w:tcW w:w="3200" w:type="dxa"/>
@@ -1512,12 +1861,6 @@
         </w:tc>
       </w:tr>
       <w:tr>
-        <w:tblPrEx>
-          <w:tblCellMar>
-            <w:top w:w="0" w:type="dxa"/>
-            <w:bottom w:w="0" w:type="dxa"/>
-          </w:tblCellMar>
-        </w:tblPrEx>
         <w:tc>
           <w:tcPr>
             <w:tcW w:w="3200" w:type="dxa"/>
@@ -1550,12 +1893,6 @@
         </w:tc>
       </w:tr>
       <w:tr>
-        <w:tblPrEx>
-          <w:tblCellMar>
-            <w:top w:w="0" w:type="dxa"/>
-            <w:bottom w:w="0" w:type="dxa"/>
-          </w:tblCellMar>
-        </w:tblPrEx>
         <w:tc>
           <w:tcPr>
             <w:tcW w:w="3200" w:type="dxa"/>
@@ -1588,12 +1925,6 @@
         </w:tc>
       </w:tr>
       <w:tr>
-        <w:tblPrEx>
-          <w:tblCellMar>
-            <w:top w:w="0" w:type="dxa"/>
-            <w:bottom w:w="0" w:type="dxa"/>
-          </w:tblCellMar>
-        </w:tblPrEx>
         <w:tc>
           <w:tcPr>
             <w:tcW w:w="3200" w:type="dxa"/>
@@ -1620,7 +1951,15 @@
           </w:tcPr>
           <w:p>
             <w:r>
-              <w:t>Envia nova tentativa após o feedback, dentro do prazo definido pelo instrutor (&lt;&lt;extend&gt;&gt; de Realizar Atividades).</w:t>
+              <w:t>Envia nova tentativa após o feedback, dentro do prazo definido pelo instrutor (&lt;&lt;</w:t>
+            </w:r>
+            <w:proofErr w:type="spellStart"/>
+            <w:r>
+              <w:t>extend</w:t>
+            </w:r>
+            <w:proofErr w:type="spellEnd"/>
+            <w:r>
+              <w:t>&gt;&gt; de Realizar Atividades).</w:t>
             </w:r>
           </w:p>
         </w:tc>
@@ -1734,7 +2073,15 @@
         <w:spacing w:after="120"/>
       </w:pPr>
       <w:r>
-        <w:t>Paleta, tipografia e componentes extraídos do protótipo em Figma (arquivo com acesso completo). O sistema já diferencia visualmente os dois perfis mantendo a mesma estrutura: verde para o aluno, azul para o instrutor.</w:t>
+        <w:t xml:space="preserve">Paleta, tipografia e componentes extraídos do protótipo em </w:t>
+      </w:r>
+      <w:proofErr w:type="spellStart"/>
+      <w:r>
+        <w:t>Figma</w:t>
+      </w:r>
+      <w:proofErr w:type="spellEnd"/>
+      <w:r>
+        <w:t xml:space="preserve"> (arquivo com acesso completo). O sistema já diferencia visualmente os dois perfis mantendo a mesma estrutura: verde para o aluno, azul para o instrutor.</w:t>
       </w:r>
     </w:p>
     <w:p>
@@ -1892,12 +2239,6 @@
         <w:gridCol w:w="6700"/>
       </w:tblGrid>
       <w:tr>
-        <w:tblPrEx>
-          <w:tblCellMar>
-            <w:top w:w="0" w:type="dxa"/>
-            <w:bottom w:w="0" w:type="dxa"/>
-          </w:tblCellMar>
-        </w:tblPrEx>
         <w:tc>
           <w:tcPr>
             <w:tcW w:w="900" w:type="dxa"/>
@@ -1920,6 +2261,7 @@
             <w:shd w:val="clear" w:color="auto" w:fill="2C3E50"/>
           </w:tcPr>
           <w:p>
+            <w:proofErr w:type="spellStart"/>
             <w:r>
               <w:rPr>
                 <w:b/>
@@ -1928,6 +2270,7 @@
               </w:rPr>
               <w:t>Hex</w:t>
             </w:r>
+            <w:proofErr w:type="spellEnd"/>
           </w:p>
         </w:tc>
         <w:tc>
@@ -1948,12 +2291,6 @@
         </w:tc>
       </w:tr>
       <w:tr>
-        <w:tblPrEx>
-          <w:tblCellMar>
-            <w:top w:w="0" w:type="dxa"/>
-            <w:bottom w:w="0" w:type="dxa"/>
-          </w:tblCellMar>
-        </w:tblPrEx>
         <w:tc>
           <w:tcPr>
             <w:tcW w:w="900" w:type="dxa"/>
@@ -1967,7 +2304,10 @@
           </w:tcPr>
           <w:p>
             <w:r>
-              <w:t>#34C759</w:t>
+              <w:t>#</w:t>
+            </w:r>
+            <w:r>
+              <w:t>1B5E20</w:t>
             </w:r>
           </w:p>
         </w:tc>
@@ -1983,12 +2323,6 @@
         </w:tc>
       </w:tr>
       <w:tr>
-        <w:tblPrEx>
-          <w:tblCellMar>
-            <w:top w:w="0" w:type="dxa"/>
-            <w:bottom w:w="0" w:type="dxa"/>
-          </w:tblCellMar>
-        </w:tblPrEx>
         <w:tc>
           <w:tcPr>
             <w:tcW w:w="900" w:type="dxa"/>
@@ -2018,12 +2352,6 @@
         </w:tc>
       </w:tr>
       <w:tr>
-        <w:tblPrEx>
-          <w:tblCellMar>
-            <w:top w:w="0" w:type="dxa"/>
-            <w:bottom w:w="0" w:type="dxa"/>
-          </w:tblCellMar>
-        </w:tblPrEx>
         <w:tc>
           <w:tcPr>
             <w:tcW w:w="900" w:type="dxa"/>
@@ -2090,12 +2418,6 @@
         <w:gridCol w:w="6700"/>
       </w:tblGrid>
       <w:tr>
-        <w:tblPrEx>
-          <w:tblCellMar>
-            <w:top w:w="0" w:type="dxa"/>
-            <w:bottom w:w="0" w:type="dxa"/>
-          </w:tblCellMar>
-        </w:tblPrEx>
         <w:tc>
           <w:tcPr>
             <w:tcW w:w="900" w:type="dxa"/>
@@ -2118,6 +2440,7 @@
             <w:shd w:val="clear" w:color="auto" w:fill="2C3E50"/>
           </w:tcPr>
           <w:p>
+            <w:proofErr w:type="spellStart"/>
             <w:r>
               <w:rPr>
                 <w:b/>
@@ -2126,6 +2449,7 @@
               </w:rPr>
               <w:t>Hex</w:t>
             </w:r>
+            <w:proofErr w:type="spellEnd"/>
           </w:p>
         </w:tc>
         <w:tc>
@@ -2146,12 +2470,6 @@
         </w:tc>
       </w:tr>
       <w:tr>
-        <w:tblPrEx>
-          <w:tblCellMar>
-            <w:top w:w="0" w:type="dxa"/>
-            <w:bottom w:w="0" w:type="dxa"/>
-          </w:tblCellMar>
-        </w:tblPrEx>
         <w:tc>
           <w:tcPr>
             <w:tcW w:w="900" w:type="dxa"/>
@@ -2181,12 +2499,6 @@
         </w:tc>
       </w:tr>
       <w:tr>
-        <w:tblPrEx>
-          <w:tblCellMar>
-            <w:top w:w="0" w:type="dxa"/>
-            <w:bottom w:w="0" w:type="dxa"/>
-          </w:tblCellMar>
-        </w:tblPrEx>
         <w:tc>
           <w:tcPr>
             <w:tcW w:w="900" w:type="dxa"/>
@@ -2216,12 +2528,6 @@
         </w:tc>
       </w:tr>
       <w:tr>
-        <w:tblPrEx>
-          <w:tblCellMar>
-            <w:top w:w="0" w:type="dxa"/>
-            <w:bottom w:w="0" w:type="dxa"/>
-          </w:tblCellMar>
-        </w:tblPrEx>
         <w:tc>
           <w:tcPr>
             <w:tcW w:w="900" w:type="dxa"/>
@@ -2288,12 +2594,6 @@
         <w:gridCol w:w="6700"/>
       </w:tblGrid>
       <w:tr>
-        <w:tblPrEx>
-          <w:tblCellMar>
-            <w:top w:w="0" w:type="dxa"/>
-            <w:bottom w:w="0" w:type="dxa"/>
-          </w:tblCellMar>
-        </w:tblPrEx>
         <w:tc>
           <w:tcPr>
             <w:tcW w:w="900" w:type="dxa"/>
@@ -2316,6 +2616,7 @@
             <w:shd w:val="clear" w:color="auto" w:fill="2C3E50"/>
           </w:tcPr>
           <w:p>
+            <w:proofErr w:type="spellStart"/>
             <w:r>
               <w:rPr>
                 <w:b/>
@@ -2324,6 +2625,7 @@
               </w:rPr>
               <w:t>Hex</w:t>
             </w:r>
+            <w:proofErr w:type="spellEnd"/>
           </w:p>
         </w:tc>
         <w:tc>
@@ -2344,12 +2646,6 @@
         </w:tc>
       </w:tr>
       <w:tr>
-        <w:tblPrEx>
-          <w:tblCellMar>
-            <w:top w:w="0" w:type="dxa"/>
-            <w:bottom w:w="0" w:type="dxa"/>
-          </w:tblCellMar>
-        </w:tblPrEx>
         <w:tc>
           <w:tcPr>
             <w:tcW w:w="900" w:type="dxa"/>
@@ -2373,8 +2669,13 @@
           </w:tcPr>
           <w:p>
             <w:r>
-              <w:t>Laranja — botão "Escrever Código", barra de progresso, brilho sob os headers</w:t>
-            </w:r>
+              <w:t xml:space="preserve">Laranja — botão "Escrever Código", barra de progresso, brilho sob os </w:t>
+            </w:r>
+            <w:proofErr w:type="spellStart"/>
+            <w:r>
+              <w:t>headers</w:t>
+            </w:r>
+            <w:proofErr w:type="spellEnd"/>
           </w:p>
         </w:tc>
       </w:tr>
@@ -2416,12 +2717,6 @@
         <w:gridCol w:w="6700"/>
       </w:tblGrid>
       <w:tr>
-        <w:tblPrEx>
-          <w:tblCellMar>
-            <w:top w:w="0" w:type="dxa"/>
-            <w:bottom w:w="0" w:type="dxa"/>
-          </w:tblCellMar>
-        </w:tblPrEx>
         <w:tc>
           <w:tcPr>
             <w:tcW w:w="900" w:type="dxa"/>
@@ -2444,6 +2739,7 @@
             <w:shd w:val="clear" w:color="auto" w:fill="2C3E50"/>
           </w:tcPr>
           <w:p>
+            <w:proofErr w:type="spellStart"/>
             <w:r>
               <w:rPr>
                 <w:b/>
@@ -2452,6 +2748,7 @@
               </w:rPr>
               <w:t>Hex</w:t>
             </w:r>
+            <w:proofErr w:type="spellEnd"/>
           </w:p>
         </w:tc>
         <w:tc>
@@ -2472,12 +2769,6 @@
         </w:tc>
       </w:tr>
       <w:tr>
-        <w:tblPrEx>
-          <w:tblCellMar>
-            <w:top w:w="0" w:type="dxa"/>
-            <w:bottom w:w="0" w:type="dxa"/>
-          </w:tblCellMar>
-        </w:tblPrEx>
         <w:tc>
           <w:tcPr>
             <w:tcW w:w="900" w:type="dxa"/>
@@ -2507,12 +2798,6 @@
         </w:tc>
       </w:tr>
       <w:tr>
-        <w:tblPrEx>
-          <w:tblCellMar>
-            <w:top w:w="0" w:type="dxa"/>
-            <w:bottom w:w="0" w:type="dxa"/>
-          </w:tblCellMar>
-        </w:tblPrEx>
         <w:tc>
           <w:tcPr>
             <w:tcW w:w="900" w:type="dxa"/>
@@ -2542,12 +2827,6 @@
         </w:tc>
       </w:tr>
       <w:tr>
-        <w:tblPrEx>
-          <w:tblCellMar>
-            <w:top w:w="0" w:type="dxa"/>
-            <w:bottom w:w="0" w:type="dxa"/>
-          </w:tblCellMar>
-        </w:tblPrEx>
         <w:tc>
           <w:tcPr>
             <w:tcW w:w="900" w:type="dxa"/>
@@ -2577,12 +2856,6 @@
         </w:tc>
       </w:tr>
       <w:tr>
-        <w:tblPrEx>
-          <w:tblCellMar>
-            <w:top w:w="0" w:type="dxa"/>
-            <w:bottom w:w="0" w:type="dxa"/>
-          </w:tblCellMar>
-        </w:tblPrEx>
         <w:tc>
           <w:tcPr>
             <w:tcW w:w="900" w:type="dxa"/>
@@ -2612,12 +2885,6 @@
         </w:tc>
       </w:tr>
       <w:tr>
-        <w:tblPrEx>
-          <w:tblCellMar>
-            <w:top w:w="0" w:type="dxa"/>
-            <w:bottom w:w="0" w:type="dxa"/>
-          </w:tblCellMar>
-        </w:tblPrEx>
         <w:tc>
           <w:tcPr>
             <w:tcW w:w="900" w:type="dxa"/>
@@ -2641,18 +2908,20 @@
           </w:tcPr>
           <w:p>
             <w:r>
-              <w:t>Texto secundário / labels inativas</w:t>
+              <w:t xml:space="preserve">Texto secundário / </w:t>
+            </w:r>
+            <w:proofErr w:type="spellStart"/>
+            <w:r>
+              <w:t>labels</w:t>
+            </w:r>
+            <w:proofErr w:type="spellEnd"/>
+            <w:r>
+              <w:t xml:space="preserve"> inativas</w:t>
             </w:r>
           </w:p>
         </w:tc>
       </w:tr>
       <w:tr>
-        <w:tblPrEx>
-          <w:tblCellMar>
-            <w:top w:w="0" w:type="dxa"/>
-            <w:bottom w:w="0" w:type="dxa"/>
-          </w:tblCellMar>
-        </w:tblPrEx>
         <w:tc>
           <w:tcPr>
             <w:tcW w:w="900" w:type="dxa"/>
@@ -2701,7 +2970,31 @@
         <w:spacing w:after="120"/>
       </w:pPr>
       <w:r>
-        <w:t>Poppins para chrome/títulos, Inter para conteúdo/feedback. Atenção: os tamanhos no Figma (36–64px) refletem um canvas de desktop grande e precisam ser reduzidos proporcionalmente na implementação real.</w:t>
+        <w:t xml:space="preserve">Poppins para </w:t>
+      </w:r>
+      <w:proofErr w:type="spellStart"/>
+      <w:r>
+        <w:t>chrome</w:t>
+      </w:r>
+      <w:proofErr w:type="spellEnd"/>
+      <w:r>
+        <w:t xml:space="preserve">/títulos, Inter para conteúdo/feedback. Atenção: os tamanhos no </w:t>
+      </w:r>
+      <w:proofErr w:type="spellStart"/>
+      <w:r>
+        <w:t>Figma</w:t>
+      </w:r>
+      <w:proofErr w:type="spellEnd"/>
+      <w:r>
+        <w:t xml:space="preserve"> (36–64px) refletem um </w:t>
+      </w:r>
+      <w:proofErr w:type="spellStart"/>
+      <w:r>
+        <w:t>canvas</w:t>
+      </w:r>
+      <w:proofErr w:type="spellEnd"/>
+      <w:r>
+        <w:t xml:space="preserve"> de desktop grande e precisam ser reduzidos proporcionalmente na implementação real.</w:t>
       </w:r>
     </w:p>
     <w:tbl>
@@ -2726,12 +3019,6 @@
         <w:gridCol w:w="6000"/>
       </w:tblGrid>
       <w:tr>
-        <w:tblPrEx>
-          <w:tblCellMar>
-            <w:top w:w="0" w:type="dxa"/>
-            <w:bottom w:w="0" w:type="dxa"/>
-          </w:tblCellMar>
-        </w:tblPrEx>
         <w:tc>
           <w:tcPr>
             <w:tcW w:w="3000" w:type="dxa"/>
@@ -2766,12 +3053,6 @@
         </w:tc>
       </w:tr>
       <w:tr>
-        <w:tblPrEx>
-          <w:tblCellMar>
-            <w:top w:w="0" w:type="dxa"/>
-            <w:bottom w:w="0" w:type="dxa"/>
-          </w:tblCellMar>
-        </w:tblPrEx>
         <w:tc>
           <w:tcPr>
             <w:tcW w:w="3000" w:type="dxa"/>
@@ -2794,20 +3075,19 @@
         </w:tc>
       </w:tr>
       <w:tr>
-        <w:tblPrEx>
-          <w:tblCellMar>
-            <w:top w:w="0" w:type="dxa"/>
-            <w:bottom w:w="0" w:type="dxa"/>
-          </w:tblCellMar>
-        </w:tblPrEx>
         <w:tc>
           <w:tcPr>
             <w:tcW w:w="3000" w:type="dxa"/>
           </w:tcPr>
           <w:p>
             <w:r>
-              <w:t>Poppins — Medium</w:t>
-            </w:r>
+              <w:t xml:space="preserve">Poppins — </w:t>
+            </w:r>
+            <w:proofErr w:type="spellStart"/>
+            <w:r>
+              <w:t>Medium</w:t>
+            </w:r>
+            <w:proofErr w:type="spellEnd"/>
           </w:p>
         </w:tc>
         <w:tc>
@@ -2822,12 +3102,6 @@
         </w:tc>
       </w:tr>
       <w:tr>
-        <w:tblPrEx>
-          <w:tblCellMar>
-            <w:top w:w="0" w:type="dxa"/>
-            <w:bottom w:w="0" w:type="dxa"/>
-          </w:tblCellMar>
-        </w:tblPrEx>
         <w:tc>
           <w:tcPr>
             <w:tcW w:w="3000" w:type="dxa"/>
@@ -2850,12 +3124,6 @@
         </w:tc>
       </w:tr>
       <w:tr>
-        <w:tblPrEx>
-          <w:tblCellMar>
-            <w:top w:w="0" w:type="dxa"/>
-            <w:bottom w:w="0" w:type="dxa"/>
-          </w:tblCellMar>
-        </w:tblPrEx>
         <w:tc>
           <w:tcPr>
             <w:tcW w:w="3000" w:type="dxa"/>
@@ -2884,8 +3152,13 @@
         <w:spacing w:before="220" w:after="100"/>
       </w:pPr>
       <w:r>
-        <w:t>Border-radius</w:t>
-      </w:r>
+        <w:t>Border-</w:t>
+      </w:r>
+      <w:proofErr w:type="spellStart"/>
+      <w:r>
+        <w:t>radius</w:t>
+      </w:r>
+      <w:proofErr w:type="spellEnd"/>
     </w:p>
     <w:tbl>
       <w:tblPr>
@@ -2909,12 +3182,6 @@
         <w:gridCol w:w="7000"/>
       </w:tblGrid>
       <w:tr>
-        <w:tblPrEx>
-          <w:tblCellMar>
-            <w:top w:w="0" w:type="dxa"/>
-            <w:bottom w:w="0" w:type="dxa"/>
-          </w:tblCellMar>
-        </w:tblPrEx>
         <w:tc>
           <w:tcPr>
             <w:tcW w:w="2000" w:type="dxa"/>
@@ -2949,12 +3216,6 @@
         </w:tc>
       </w:tr>
       <w:tr>
-        <w:tblPrEx>
-          <w:tblCellMar>
-            <w:top w:w="0" w:type="dxa"/>
-            <w:bottom w:w="0" w:type="dxa"/>
-          </w:tblCellMar>
-        </w:tblPrEx>
         <w:tc>
           <w:tcPr>
             <w:tcW w:w="2000" w:type="dxa"/>
@@ -2977,12 +3238,6 @@
         </w:tc>
       </w:tr>
       <w:tr>
-        <w:tblPrEx>
-          <w:tblCellMar>
-            <w:top w:w="0" w:type="dxa"/>
-            <w:bottom w:w="0" w:type="dxa"/>
-          </w:tblCellMar>
-        </w:tblPrEx>
         <w:tc>
           <w:tcPr>
             <w:tcW w:w="2000" w:type="dxa"/>
@@ -3005,12 +3260,6 @@
         </w:tc>
       </w:tr>
       <w:tr>
-        <w:tblPrEx>
-          <w:tblCellMar>
-            <w:top w:w="0" w:type="dxa"/>
-            <w:bottom w:w="0" w:type="dxa"/>
-          </w:tblCellMar>
-        </w:tblPrEx>
         <w:tc>
           <w:tcPr>
             <w:tcW w:w="2000" w:type="dxa"/>
@@ -3033,12 +3282,6 @@
         </w:tc>
       </w:tr>
       <w:tr>
-        <w:tblPrEx>
-          <w:tblCellMar>
-            <w:top w:w="0" w:type="dxa"/>
-            <w:bottom w:w="0" w:type="dxa"/>
-          </w:tblCellMar>
-        </w:tblPrEx>
         <w:tc>
           <w:tcPr>
             <w:tcW w:w="2000" w:type="dxa"/>
@@ -3061,12 +3304,6 @@
         </w:tc>
       </w:tr>
       <w:tr>
-        <w:tblPrEx>
-          <w:tblCellMar>
-            <w:top w:w="0" w:type="dxa"/>
-            <w:bottom w:w="0" w:type="dxa"/>
-          </w:tblCellMar>
-        </w:tblPrEx>
         <w:tc>
           <w:tcPr>
             <w:tcW w:w="2000" w:type="dxa"/>
@@ -3089,12 +3326,6 @@
         </w:tc>
       </w:tr>
       <w:tr>
-        <w:tblPrEx>
-          <w:tblCellMar>
-            <w:top w:w="0" w:type="dxa"/>
-            <w:bottom w:w="0" w:type="dxa"/>
-          </w:tblCellMar>
-        </w:tblPrEx>
         <w:tc>
           <w:tcPr>
             <w:tcW w:w="2000" w:type="dxa"/>
@@ -3117,12 +3348,6 @@
         </w:tc>
       </w:tr>
       <w:tr>
-        <w:tblPrEx>
-          <w:tblCellMar>
-            <w:top w:w="0" w:type="dxa"/>
-            <w:bottom w:w="0" w:type="dxa"/>
-          </w:tblCellMar>
-        </w:tblPrEx>
         <w:tc>
           <w:tcPr>
             <w:tcW w:w="2000" w:type="dxa"/>
@@ -3139,18 +3364,20 @@
           </w:tcPr>
           <w:p>
             <w:r>
-              <w:t>Balão de feedback da IA (chat bubble)</w:t>
+              <w:t xml:space="preserve">Balão de feedback da IA (chat </w:t>
+            </w:r>
+            <w:proofErr w:type="spellStart"/>
+            <w:r>
+              <w:t>bubble</w:t>
+            </w:r>
+            <w:proofErr w:type="spellEnd"/>
+            <w:r>
+              <w:t>)</w:t>
             </w:r>
           </w:p>
         </w:tc>
       </w:tr>
       <w:tr>
-        <w:tblPrEx>
-          <w:tblCellMar>
-            <w:top w:w="0" w:type="dxa"/>
-            <w:bottom w:w="0" w:type="dxa"/>
-          </w:tblCellMar>
-        </w:tblPrEx>
         <w:tc>
           <w:tcPr>
             <w:tcW w:w="2000" w:type="dxa"/>
@@ -3199,7 +3426,15 @@
         <w:t xml:space="preserve">Barra superior (header): </w:t>
       </w:r>
       <w:r>
-        <w:t>Faixa colorida de ponta a ponta (verde no aluno, azul no instrutor), logo circular + "The Farm Edu" à esquerda, avatar do usuário à direita.</w:t>
+        <w:t xml:space="preserve">Faixa colorida de ponta a ponta (verde no aluno, azul no instrutor), logo circular + "The </w:t>
+      </w:r>
+      <w:proofErr w:type="spellStart"/>
+      <w:r>
+        <w:t>Farm</w:t>
+      </w:r>
+      <w:proofErr w:type="spellEnd"/>
+      <w:r>
+        <w:t xml:space="preserve"> Edu" à esquerda, avatar do usuário à direita.</w:t>
       </w:r>
     </w:p>
     <w:p>
@@ -3239,7 +3474,15 @@
         <w:t xml:space="preserve">Cards de matéria/atividade: </w:t>
       </w:r>
       <w:r>
-        <w:t>Barra de título colorida (verde) com texto preto em bold, levemente rotacionado (~-0.35°) — efeito "colado à mão", proposital.</w:t>
+        <w:t xml:space="preserve">Barra de título colorida (verde) com texto preto em </w:t>
+      </w:r>
+      <w:proofErr w:type="spellStart"/>
+      <w:r>
+        <w:t>bold</w:t>
+      </w:r>
+      <w:proofErr w:type="spellEnd"/>
+      <w:r>
+        <w:t>, levemente rotacionado (~-0.35°) — efeito "colado à mão", proposital.</w:t>
       </w:r>
     </w:p>
     <w:p>
@@ -3259,7 +3502,23 @@
         <w:t xml:space="preserve">Feed / Mural: </w:t>
       </w:r>
       <w:r>
-        <w:t>Itens em formato de pílula longa; o mais recente vem com borda verde de destaque. Título em bold, timestamp com opacidade reduzida (75%).</w:t>
+        <w:t xml:space="preserve">Itens em formato de pílula longa; o mais recente vem com borda verde de destaque. Título em </w:t>
+      </w:r>
+      <w:proofErr w:type="spellStart"/>
+      <w:r>
+        <w:t>bold</w:t>
+      </w:r>
+      <w:proofErr w:type="spellEnd"/>
+      <w:r>
+        <w:t xml:space="preserve">, </w:t>
+      </w:r>
+      <w:proofErr w:type="spellStart"/>
+      <w:r>
+        <w:t>timestamp</w:t>
+      </w:r>
+      <w:proofErr w:type="spellEnd"/>
+      <w:r>
+        <w:t xml:space="preserve"> com opacidade reduzida (75%).</w:t>
       </w:r>
     </w:p>
     <w:p>
@@ -3279,7 +3538,15 @@
         <w:t xml:space="preserve">Botões: </w:t>
       </w:r>
       <w:r>
-        <w:t>Formato pílula, preenchimento sólido (verde para ação primária do aluno, laranja para "escrever código"), texto branco em bold.</w:t>
+        <w:t xml:space="preserve">Formato pílula, preenchimento sólido (verde para ação primária do aluno, laranja para "escrever código"), texto branco em </w:t>
+      </w:r>
+      <w:proofErr w:type="spellStart"/>
+      <w:r>
+        <w:t>bold</w:t>
+      </w:r>
+      <w:proofErr w:type="spellEnd"/>
+      <w:r>
+        <w:t>.</w:t>
       </w:r>
     </w:p>
     <w:p>
@@ -3316,7 +3583,15 @@
         <w:spacing w:after="120"/>
       </w:pPr>
       <w:r>
-        <w:t>Baseado em protótipo de aluno (acesso apenas de visualização); aproveitar a mecânica, não o estilo visual (pixel art), que será substituído pela linguagem acima (cards arredondados, Poppins, paleta verde/azul):</w:t>
+        <w:t xml:space="preserve">Baseado em protótipo de aluno (acesso apenas de visualização); aproveitar a mecânica, não o estilo visual (pixel </w:t>
+      </w:r>
+      <w:proofErr w:type="spellStart"/>
+      <w:r>
+        <w:t>art</w:t>
+      </w:r>
+      <w:proofErr w:type="spellEnd"/>
+      <w:r>
+        <w:t>), que será substituído pela linguagem acima (cards arredondados, Poppins, paleta verde/azul):</w:t>
       </w:r>
     </w:p>
     <w:p>
@@ -3395,7 +3670,31 @@
         <w:spacing w:after="120"/>
       </w:pPr>
       <w:r>
-        <w:t>56 alunos (21 manhã + 35 tarde), organizados em squads de 3-4 pessoas, cada um dono de um módulo (seção 5.2) ponta a ponta — sem separação fixa por camada. Tech leads rotativos (2-3 alunos por sprint) revisam Pull Requests junto ao instrutor.</w:t>
+        <w:t xml:space="preserve">56 alunos (21 manhã + 35 tarde), organizados em </w:t>
+      </w:r>
+      <w:proofErr w:type="spellStart"/>
+      <w:r>
+        <w:t>squads</w:t>
+      </w:r>
+      <w:proofErr w:type="spellEnd"/>
+      <w:r>
+        <w:t xml:space="preserve"> de 3-4 pessoas, cada um dono de um módulo (seção 5.2) ponta a ponta — sem separação fixa por camada. Tech leads rotativos (2-3 alunos por sprint) revisam </w:t>
+      </w:r>
+      <w:proofErr w:type="spellStart"/>
+      <w:r>
+        <w:t>Pull</w:t>
+      </w:r>
+      <w:proofErr w:type="spellEnd"/>
+      <w:r>
+        <w:t xml:space="preserve"> </w:t>
+      </w:r>
+      <w:proofErr w:type="spellStart"/>
+      <w:r>
+        <w:t>Requests</w:t>
+      </w:r>
+      <w:proofErr w:type="spellEnd"/>
+      <w:r>
+        <w:t xml:space="preserve"> junto ao instrutor.</w:t>
       </w:r>
     </w:p>
     <w:p>
@@ -3424,7 +3723,15 @@
         <w:t xml:space="preserve">Repositório: </w:t>
       </w:r>
       <w:r>
-        <w:t>uma organização e um repositório monorepo no GitHub.</w:t>
+        <w:t xml:space="preserve">uma organização e um repositório </w:t>
+      </w:r>
+      <w:proofErr w:type="spellStart"/>
+      <w:r>
+        <w:t>monorepo</w:t>
+      </w:r>
+      <w:proofErr w:type="spellEnd"/>
+      <w:r>
+        <w:t xml:space="preserve"> no GitHub.</w:t>
       </w:r>
     </w:p>
     <w:p>
@@ -3444,27 +3751,96 @@
         <w:t xml:space="preserve">Gestão de tarefas: </w:t>
       </w:r>
       <w:r>
-        <w:t>GitHub Issues + GitHub Projects (kanban) — usado no lugar do Jira, cujo plano gratuito cobre só até 10 usuários.</w:t>
-      </w:r>
-    </w:p>
-    <w:p>
-      <w:pPr>
-        <w:pStyle w:val="PargrafodaLista"/>
-        <w:numPr>
-          <w:ilvl w:val="0"/>
-          <w:numId w:val="2"/>
-        </w:numPr>
-        <w:spacing w:after="100"/>
-      </w:pPr>
-      <w:r>
-        <w:rPr>
-          <w:b/>
-          <w:bCs/>
-        </w:rPr>
-        <w:t xml:space="preserve">Branch protection: </w:t>
-      </w:r>
-      <w:r>
-        <w:t>main protegida; todo código entra via Pull Request revisado.</w:t>
+        <w:t xml:space="preserve">GitHub </w:t>
+      </w:r>
+      <w:proofErr w:type="spellStart"/>
+      <w:r>
+        <w:t>Issues</w:t>
+      </w:r>
+      <w:proofErr w:type="spellEnd"/>
+      <w:r>
+        <w:t xml:space="preserve"> + GitHub </w:t>
+      </w:r>
+      <w:proofErr w:type="spellStart"/>
+      <w:r>
+        <w:t>Projects</w:t>
+      </w:r>
+      <w:proofErr w:type="spellEnd"/>
+      <w:r>
+        <w:t xml:space="preserve"> (</w:t>
+      </w:r>
+      <w:proofErr w:type="spellStart"/>
+      <w:r>
+        <w:t>kanban</w:t>
+      </w:r>
+      <w:proofErr w:type="spellEnd"/>
+      <w:r>
+        <w:t xml:space="preserve">) — usado no lugar do </w:t>
+      </w:r>
+      <w:proofErr w:type="spellStart"/>
+      <w:r>
+        <w:t>Jira</w:t>
+      </w:r>
+      <w:proofErr w:type="spellEnd"/>
+      <w:r>
+        <w:t>, cujo plano gratuito cobre só até 10 usuários.</w:t>
+      </w:r>
+    </w:p>
+    <w:p>
+      <w:pPr>
+        <w:pStyle w:val="PargrafodaLista"/>
+        <w:numPr>
+          <w:ilvl w:val="0"/>
+          <w:numId w:val="2"/>
+        </w:numPr>
+        <w:spacing w:after="100"/>
+      </w:pPr>
+      <w:r>
+        <w:rPr>
+          <w:b/>
+          <w:bCs/>
+        </w:rPr>
+        <w:t xml:space="preserve">Branch </w:t>
+      </w:r>
+      <w:proofErr w:type="spellStart"/>
+      <w:r>
+        <w:rPr>
+          <w:b/>
+          <w:bCs/>
+        </w:rPr>
+        <w:t>protection</w:t>
+      </w:r>
+      <w:proofErr w:type="spellEnd"/>
+      <w:r>
+        <w:rPr>
+          <w:b/>
+          <w:bCs/>
+        </w:rPr>
+        <w:t xml:space="preserve">: </w:t>
+      </w:r>
+      <w:proofErr w:type="spellStart"/>
+      <w:r>
+        <w:t>main</w:t>
+      </w:r>
+      <w:proofErr w:type="spellEnd"/>
+      <w:r>
+        <w:t xml:space="preserve"> protegida; todo código entra via </w:t>
+      </w:r>
+      <w:proofErr w:type="spellStart"/>
+      <w:r>
+        <w:t>Pull</w:t>
+      </w:r>
+      <w:proofErr w:type="spellEnd"/>
+      <w:r>
+        <w:t xml:space="preserve"> </w:t>
+      </w:r>
+      <w:proofErr w:type="spellStart"/>
+      <w:r>
+        <w:t>Request</w:t>
+      </w:r>
+      <w:proofErr w:type="spellEnd"/>
+      <w:r>
+        <w:t xml:space="preserve"> revisado.</w:t>
       </w:r>
     </w:p>
     <w:p>
@@ -3484,7 +3860,23 @@
         <w:t xml:space="preserve">Integração entre turmas: </w:t>
       </w:r>
       <w:r>
-        <w:t>assíncrona via PRs, board compartilhado e canal de comunicação único entre squads dependentes.</w:t>
+        <w:t xml:space="preserve">assíncrona via </w:t>
+      </w:r>
+      <w:proofErr w:type="spellStart"/>
+      <w:r>
+        <w:t>PRs</w:t>
+      </w:r>
+      <w:proofErr w:type="spellEnd"/>
+      <w:r>
+        <w:t xml:space="preserve">, board compartilhado e canal de comunicação único entre </w:t>
+      </w:r>
+      <w:proofErr w:type="spellStart"/>
+      <w:r>
+        <w:t>squads</w:t>
+      </w:r>
+      <w:proofErr w:type="spellEnd"/>
+      <w:r>
+        <w:t xml:space="preserve"> dependentes.</w:t>
       </w:r>
     </w:p>
     <w:p>
@@ -3530,12 +3922,6 @@
         <w:gridCol w:w="5500"/>
       </w:tblGrid>
       <w:tr>
-        <w:tblPrEx>
-          <w:tblCellMar>
-            <w:top w:w="0" w:type="dxa"/>
-            <w:bottom w:w="0" w:type="dxa"/>
-          </w:tblCellMar>
-        </w:tblPrEx>
         <w:tc>
           <w:tcPr>
             <w:tcW w:w="2000" w:type="dxa"/>
@@ -3586,12 +3972,6 @@
         </w:tc>
       </w:tr>
       <w:tr>
-        <w:tblPrEx>
-          <w:tblCellMar>
-            <w:top w:w="0" w:type="dxa"/>
-            <w:bottom w:w="0" w:type="dxa"/>
-          </w:tblCellMar>
-        </w:tblPrEx>
         <w:tc>
           <w:tcPr>
             <w:tcW w:w="2000" w:type="dxa"/>
@@ -3621,18 +4001,44 @@
           </w:tcPr>
           <w:p>
             <w:r>
-              <w:t>Apresentação da documentação; ensino de Git/branch/PR; implementação do core; formação dos squads; setup de ambiente; Judge0 e teste de Llama local.</w:t>
+              <w:t xml:space="preserve">Apresentação da documentação; ensino de </w:t>
+            </w:r>
+            <w:proofErr w:type="spellStart"/>
+            <w:r>
+              <w:t>Git</w:t>
+            </w:r>
+            <w:proofErr w:type="spellEnd"/>
+            <w:r>
+              <w:t>/</w:t>
+            </w:r>
+            <w:proofErr w:type="spellStart"/>
+            <w:r>
+              <w:t>branch</w:t>
+            </w:r>
+            <w:proofErr w:type="spellEnd"/>
+            <w:r>
+              <w:t xml:space="preserve">/PR; implementação do core; formação dos </w:t>
+            </w:r>
+            <w:proofErr w:type="spellStart"/>
+            <w:r>
+              <w:t>squads</w:t>
+            </w:r>
+            <w:proofErr w:type="spellEnd"/>
+            <w:r>
+              <w:t xml:space="preserve">; setup de ambiente; Judge0 e teste de </w:t>
+            </w:r>
+            <w:proofErr w:type="spellStart"/>
+            <w:r>
+              <w:t>Llama</w:t>
+            </w:r>
+            <w:proofErr w:type="spellEnd"/>
+            <w:r>
+              <w:t xml:space="preserve"> local.</w:t>
             </w:r>
           </w:p>
         </w:tc>
       </w:tr>
       <w:tr>
-        <w:tblPrEx>
-          <w:tblCellMar>
-            <w:top w:w="0" w:type="dxa"/>
-            <w:bottom w:w="0" w:type="dxa"/>
-          </w:tblCellMar>
-        </w:tblPrEx>
         <w:tc>
           <w:tcPr>
             <w:tcW w:w="2000" w:type="dxa"/>
@@ -3662,18 +4068,28 @@
           </w:tcPr>
           <w:p>
             <w:r>
-              <w:t>Modelagem final do banco; PDO prepared statements; login dos dois perfis; CRUD básico de turmas/cursos.</w:t>
+              <w:t xml:space="preserve">Modelagem final do banco; PDO </w:t>
+            </w:r>
+            <w:proofErr w:type="spellStart"/>
+            <w:r>
+              <w:t>prepared</w:t>
+            </w:r>
+            <w:proofErr w:type="spellEnd"/>
+            <w:r>
+              <w:t xml:space="preserve"> </w:t>
+            </w:r>
+            <w:proofErr w:type="spellStart"/>
+            <w:r>
+              <w:t>statements</w:t>
+            </w:r>
+            <w:proofErr w:type="spellEnd"/>
+            <w:r>
+              <w:t>; login dos dois perfis; CRUD básico de turmas/cursos.</w:t>
             </w:r>
           </w:p>
         </w:tc>
       </w:tr>
       <w:tr>
-        <w:tblPrEx>
-          <w:tblCellMar>
-            <w:top w:w="0" w:type="dxa"/>
-            <w:bottom w:w="0" w:type="dxa"/>
-          </w:tblCellMar>
-        </w:tblPrEx>
         <w:tc>
           <w:tcPr>
             <w:tcW w:w="2000" w:type="dxa"/>
@@ -3709,12 +4125,6 @@
         </w:tc>
       </w:tr>
       <w:tr>
-        <w:tblPrEx>
-          <w:tblCellMar>
-            <w:top w:w="0" w:type="dxa"/>
-            <w:bottom w:w="0" w:type="dxa"/>
-          </w:tblCellMar>
-        </w:tblPrEx>
         <w:tc>
           <w:tcPr>
             <w:tcW w:w="2000" w:type="dxa"/>
@@ -3744,18 +4154,22 @@
           </w:tcPr>
           <w:p>
             <w:r>
-              <w:t>Regras de XP; fazenda como mini-jogo; integração XP → estado da fazenda.</w:t>
+              <w:t xml:space="preserve">Regras de XP; fazenda como </w:t>
+            </w:r>
+            <w:proofErr w:type="spellStart"/>
+            <w:proofErr w:type="gramStart"/>
+            <w:r>
+              <w:t>mini-jogo</w:t>
+            </w:r>
+            <w:proofErr w:type="spellEnd"/>
+            <w:proofErr w:type="gramEnd"/>
+            <w:r>
+              <w:t>; integração XP → estado da fazenda.</w:t>
             </w:r>
           </w:p>
         </w:tc>
       </w:tr>
       <w:tr>
-        <w:tblPrEx>
-          <w:tblCellMar>
-            <w:top w:w="0" w:type="dxa"/>
-            <w:bottom w:w="0" w:type="dxa"/>
-          </w:tblCellMar>
-        </w:tblPrEx>
         <w:tc>
           <w:tcPr>
             <w:tcW w:w="2000" w:type="dxa"/>
@@ -3791,12 +4205,6 @@
         </w:tc>
       </w:tr>
       <w:tr>
-        <w:tblPrEx>
-          <w:tblCellMar>
-            <w:top w:w="0" w:type="dxa"/>
-            <w:bottom w:w="0" w:type="dxa"/>
-          </w:tblCellMar>
-        </w:tblPrEx>
         <w:tc>
           <w:tcPr>
             <w:tcW w:w="2000" w:type="dxa"/>
@@ -3825,8 +4233,21 @@
             <w:tcW w:w="5500" w:type="dxa"/>
           </w:tcPr>
           <w:p>
-            <w:r>
-              <w:t>Deploy; documentação final; apresentação por squad.</w:t>
+            <w:proofErr w:type="spellStart"/>
+            <w:r>
+              <w:t>Deploy</w:t>
+            </w:r>
+            <w:proofErr w:type="spellEnd"/>
+            <w:r>
+              <w:t xml:space="preserve">; documentação final; apresentação por </w:t>
+            </w:r>
+            <w:proofErr w:type="spellStart"/>
+            <w:r>
+              <w:t>squad</w:t>
+            </w:r>
+            <w:proofErr w:type="spellEnd"/>
+            <w:r>
+              <w:t>.</w:t>
             </w:r>
           </w:p>
         </w:tc>
@@ -4539,6 +4960,7 @@
   <w:style w:type="character" w:default="1" w:styleId="Fontepargpadro">
     <w:name w:val="Default Paragraph Font"/>
     <w:uiPriority w:val="1"/>
+    <w:semiHidden/>
     <w:unhideWhenUsed/>
   </w:style>
   <w:style w:type="table" w:default="1" w:styleId="Tabelanormal">

</xml_diff>

<commit_message>
Mudança de paleta realizada, saimos de #34C759 para #1B5E20 (#88)
Resolução do problema #73
</commit_message>
<xml_diff>
--- a/docs/The_Farmer_Edu - Documentacao Oficial do Sistema.docx
+++ b/docs/The_Farmer_Edu - Documentacao Oficial do Sistema.docx
@@ -157,7 +157,31 @@
         <w:t xml:space="preserve">Natureza do projeto: </w:t>
       </w:r>
       <w:r>
-        <w:t>desenvolvido simultaneamente pelas duas turmas, organizadas em squads mistos com liderança técnica rotativa, sem separação fixa por camada (front-end/back-end/banco de dados).</w:t>
+        <w:t xml:space="preserve">desenvolvido simultaneamente pelas duas turmas, organizadas em </w:t>
+      </w:r>
+      <w:proofErr w:type="spellStart"/>
+      <w:r>
+        <w:t>squads</w:t>
+      </w:r>
+      <w:proofErr w:type="spellEnd"/>
+      <w:r>
+        <w:t xml:space="preserve"> mistos com liderança técnica rotativa, sem separação fixa por camada (front-</w:t>
+      </w:r>
+      <w:proofErr w:type="spellStart"/>
+      <w:r>
+        <w:t>end</w:t>
+      </w:r>
+      <w:proofErr w:type="spellEnd"/>
+      <w:r>
+        <w:t>/</w:t>
+      </w:r>
+      <w:proofErr w:type="spellStart"/>
+      <w:r>
+        <w:t>back-end</w:t>
+      </w:r>
+      <w:proofErr w:type="spellEnd"/>
+      <w:r>
+        <w:t>/banco de dados).</w:t>
       </w:r>
     </w:p>
     <w:p>
@@ -424,7 +448,17 @@
         <w:t xml:space="preserve">RF12 — </w:t>
       </w:r>
       <w:r>
-        <w:t>Acesso à Fazenda (mini-jogo) a partir de um botão dedicado.</w:t>
+        <w:t>Acesso à Fazenda (</w:t>
+      </w:r>
+      <w:proofErr w:type="spellStart"/>
+      <w:proofErr w:type="gramStart"/>
+      <w:r>
+        <w:t>mini-jogo</w:t>
+      </w:r>
+      <w:proofErr w:type="spellEnd"/>
+      <w:proofErr w:type="gramEnd"/>
+      <w:r>
+        <w:t>) a partir de um botão dedicado.</w:t>
       </w:r>
     </w:p>
     <w:p>
@@ -841,7 +875,17 @@
         <w:t xml:space="preserve">RN05 — </w:t>
       </w:r>
       <w:r>
-        <w:t>A fazenda é um mini-jogo interativo, nunca uma imagem estática; evolui ou retrocede conforme o desempenho.</w:t>
+        <w:t xml:space="preserve">A fazenda é um </w:t>
+      </w:r>
+      <w:proofErr w:type="spellStart"/>
+      <w:proofErr w:type="gramStart"/>
+      <w:r>
+        <w:t>mini-jogo</w:t>
+      </w:r>
+      <w:proofErr w:type="spellEnd"/>
+      <w:proofErr w:type="gramEnd"/>
+      <w:r>
+        <w:t xml:space="preserve"> interativo, nunca uma imagem estática; evolui ou retrocede conforme o desempenho.</w:t>
       </w:r>
     </w:p>
     <w:p>
@@ -913,7 +957,15 @@
         <w:spacing w:after="120"/>
       </w:pPr>
       <w:r>
-        <w:t>PHP puro (sem framework) + PDO + MySQL/MariaDB, priorizando os fundamentos que a turma está aprendendo nesta UC.</w:t>
+        <w:t>PHP puro (sem framework) + PDO + MySQL/</w:t>
+      </w:r>
+      <w:proofErr w:type="spellStart"/>
+      <w:r>
+        <w:t>MariaDB</w:t>
+      </w:r>
+      <w:proofErr w:type="spellEnd"/>
+      <w:r>
+        <w:t>, priorizando os fundamentos que a turma está aprendendo nesta UC.</w:t>
       </w:r>
     </w:p>
     <w:p>
@@ -930,7 +982,23 @@
         <w:spacing w:after="120"/>
       </w:pPr>
       <w:r>
-        <w:t>O código é organizado em módulos verticais — cada um concentra sua parte de banco de dados, lógica PHP e views — em vez de camadas horizontais. Isso permite que cada squad seja dono de um módulo ponta a ponta, minimizando conflitos de merge entre os 56 contribuidores:</w:t>
+        <w:t xml:space="preserve">O código é organizado em módulos verticais — cada um concentra sua parte de banco de dados, lógica PHP e </w:t>
+      </w:r>
+      <w:proofErr w:type="spellStart"/>
+      <w:r>
+        <w:t>views</w:t>
+      </w:r>
+      <w:proofErr w:type="spellEnd"/>
+      <w:r>
+        <w:t xml:space="preserve"> — em vez de camadas horizontais. Isso permite que cada </w:t>
+      </w:r>
+      <w:proofErr w:type="spellStart"/>
+      <w:r>
+        <w:t>squad</w:t>
+      </w:r>
+      <w:proofErr w:type="spellEnd"/>
+      <w:r>
+        <w:t xml:space="preserve"> seja dono de um módulo ponta a ponta, minimizando conflitos de merge entre os 56 contribuidores:</w:t>
       </w:r>
     </w:p>
     <w:p>
@@ -958,35 +1026,25 @@
           <w:sz w:val="18"/>
           <w:szCs w:val="18"/>
         </w:rPr>
-        <w:t>├── core/            (roteador, conexão PDO, sessão — uso restrito)</w:t>
-      </w:r>
-    </w:p>
-    <w:p>
-      <w:pPr>
-        <w:shd w:val="clear" w:color="auto" w:fill="F2F2F2"/>
-        <w:spacing w:after="40"/>
-      </w:pPr>
+        <w:t xml:space="preserve">├── core/         </w:t>
+      </w:r>
+      <w:proofErr w:type="gramStart"/>
       <w:r>
         <w:rPr>
           <w:rFonts w:ascii="Consolas" w:eastAsia="Consolas" w:hAnsi="Consolas" w:cs="Consolas"/>
           <w:sz w:val="18"/>
           <w:szCs w:val="18"/>
         </w:rPr>
-        <w:t>└── modules/</w:t>
-      </w:r>
-    </w:p>
-    <w:p>
-      <w:pPr>
-        <w:shd w:val="clear" w:color="auto" w:fill="F2F2F2"/>
-        <w:spacing w:after="40"/>
-      </w:pPr>
+        <w:t xml:space="preserve">   (</w:t>
+      </w:r>
+      <w:proofErr w:type="gramEnd"/>
       <w:r>
         <w:rPr>
           <w:rFonts w:ascii="Consolas" w:eastAsia="Consolas" w:hAnsi="Consolas" w:cs="Consolas"/>
           <w:sz w:val="18"/>
           <w:szCs w:val="18"/>
         </w:rPr>
-        <w:t xml:space="preserve">    ├── auth — autenticação e sessão dos dois perfis</w:t>
+        <w:t>roteador, conexão PDO, sessão — uso restrito)</w:t>
       </w:r>
     </w:p>
     <w:p>
@@ -1000,7 +1058,7 @@
           <w:sz w:val="18"/>
           <w:szCs w:val="18"/>
         </w:rPr>
-        <w:t xml:space="preserve">    ├── turmas_cursos — CRUD de curso, turma e matrícula</w:t>
+        <w:t>└── modules/</w:t>
       </w:r>
     </w:p>
     <w:p>
@@ -1014,35 +1072,25 @@
           <w:sz w:val="18"/>
           <w:szCs w:val="18"/>
         </w:rPr>
-        <w:t xml:space="preserve">    ├── atividades — CRUD de atividades (instrutor)</w:t>
-      </w:r>
-    </w:p>
-    <w:p>
-      <w:pPr>
-        <w:shd w:val="clear" w:color="auto" w:fill="F2F2F2"/>
-        <w:spacing w:after="40"/>
-      </w:pPr>
+        <w:t xml:space="preserve">    ├── </w:t>
+      </w:r>
+      <w:proofErr w:type="spellStart"/>
       <w:r>
         <w:rPr>
           <w:rFonts w:ascii="Consolas" w:eastAsia="Consolas" w:hAnsi="Consolas" w:cs="Consolas"/>
           <w:sz w:val="18"/>
           <w:szCs w:val="18"/>
         </w:rPr>
-        <w:t xml:space="preserve">    ├── submissoes — envio da resposta do aluno e integração com o Judge0</w:t>
-      </w:r>
-    </w:p>
-    <w:p>
-      <w:pPr>
-        <w:shd w:val="clear" w:color="auto" w:fill="F2F2F2"/>
-        <w:spacing w:after="40"/>
-      </w:pPr>
+        <w:t>auth</w:t>
+      </w:r>
+      <w:proofErr w:type="spellEnd"/>
       <w:r>
         <w:rPr>
           <w:rFonts w:ascii="Consolas" w:eastAsia="Consolas" w:hAnsi="Consolas" w:cs="Consolas"/>
           <w:sz w:val="18"/>
           <w:szCs w:val="18"/>
         </w:rPr>
-        <w:t xml:space="preserve">    ├── feedback_ia — geração de feedback e nota sugerida via IA</w:t>
+        <w:t xml:space="preserve"> — autenticação e sessão dos dois perfis</w:t>
       </w:r>
     </w:p>
     <w:p>
@@ -1056,35 +1104,25 @@
           <w:sz w:val="18"/>
           <w:szCs w:val="18"/>
         </w:rPr>
-        <w:t xml:space="preserve">    ├── notas — atribuição e consulta de notas</w:t>
-      </w:r>
-    </w:p>
-    <w:p>
-      <w:pPr>
-        <w:shd w:val="clear" w:color="auto" w:fill="F2F2F2"/>
-        <w:spacing w:after="40"/>
-      </w:pPr>
+        <w:t xml:space="preserve">    ├── </w:t>
+      </w:r>
+      <w:proofErr w:type="spellStart"/>
       <w:r>
         <w:rPr>
           <w:rFonts w:ascii="Consolas" w:eastAsia="Consolas" w:hAnsi="Consolas" w:cs="Consolas"/>
           <w:sz w:val="18"/>
           <w:szCs w:val="18"/>
         </w:rPr>
-        <w:t xml:space="preserve">    ├── gamificacao — motor de regras de XP</w:t>
-      </w:r>
-    </w:p>
-    <w:p>
-      <w:pPr>
-        <w:shd w:val="clear" w:color="auto" w:fill="F2F2F2"/>
-        <w:spacing w:after="40"/>
-      </w:pPr>
+        <w:t>turmas_cursos</w:t>
+      </w:r>
+      <w:proofErr w:type="spellEnd"/>
       <w:r>
         <w:rPr>
           <w:rFonts w:ascii="Consolas" w:eastAsia="Consolas" w:hAnsi="Consolas" w:cs="Consolas"/>
           <w:sz w:val="18"/>
           <w:szCs w:val="18"/>
         </w:rPr>
-        <w:t xml:space="preserve">    ├── fazenda — mini-jogo e seus estados visuais</w:t>
+        <w:t xml:space="preserve"> — CRUD de curso, turma e matrícula</w:t>
       </w:r>
     </w:p>
     <w:p>
@@ -1098,7 +1136,183 @@
           <w:sz w:val="18"/>
           <w:szCs w:val="18"/>
         </w:rPr>
-        <w:t xml:space="preserve">    ├── notificacoes — avisos de atividade pendente/nota</w:t>
+        <w:t xml:space="preserve">    ├── atividades — CRUD de atividades (instrutor)</w:t>
+      </w:r>
+    </w:p>
+    <w:p>
+      <w:pPr>
+        <w:shd w:val="clear" w:color="auto" w:fill="F2F2F2"/>
+        <w:spacing w:after="40"/>
+      </w:pPr>
+      <w:r>
+        <w:rPr>
+          <w:rFonts w:ascii="Consolas" w:eastAsia="Consolas" w:hAnsi="Consolas" w:cs="Consolas"/>
+          <w:sz w:val="18"/>
+          <w:szCs w:val="18"/>
+        </w:rPr>
+        <w:t xml:space="preserve">    ├── </w:t>
+      </w:r>
+      <w:proofErr w:type="spellStart"/>
+      <w:r>
+        <w:rPr>
+          <w:rFonts w:ascii="Consolas" w:eastAsia="Consolas" w:hAnsi="Consolas" w:cs="Consolas"/>
+          <w:sz w:val="18"/>
+          <w:szCs w:val="18"/>
+        </w:rPr>
+        <w:t>submissoes</w:t>
+      </w:r>
+      <w:proofErr w:type="spellEnd"/>
+      <w:r>
+        <w:rPr>
+          <w:rFonts w:ascii="Consolas" w:eastAsia="Consolas" w:hAnsi="Consolas" w:cs="Consolas"/>
+          <w:sz w:val="18"/>
+          <w:szCs w:val="18"/>
+        </w:rPr>
+        <w:t xml:space="preserve"> — envio da resposta do aluno e integração com o Judge0</w:t>
+      </w:r>
+    </w:p>
+    <w:p>
+      <w:pPr>
+        <w:shd w:val="clear" w:color="auto" w:fill="F2F2F2"/>
+        <w:spacing w:after="40"/>
+      </w:pPr>
+      <w:r>
+        <w:rPr>
+          <w:rFonts w:ascii="Consolas" w:eastAsia="Consolas" w:hAnsi="Consolas" w:cs="Consolas"/>
+          <w:sz w:val="18"/>
+          <w:szCs w:val="18"/>
+        </w:rPr>
+        <w:t xml:space="preserve">    ├── </w:t>
+      </w:r>
+      <w:proofErr w:type="spellStart"/>
+      <w:r>
+        <w:rPr>
+          <w:rFonts w:ascii="Consolas" w:eastAsia="Consolas" w:hAnsi="Consolas" w:cs="Consolas"/>
+          <w:sz w:val="18"/>
+          <w:szCs w:val="18"/>
+        </w:rPr>
+        <w:t>feedback_ia</w:t>
+      </w:r>
+      <w:proofErr w:type="spellEnd"/>
+      <w:r>
+        <w:rPr>
+          <w:rFonts w:ascii="Consolas" w:eastAsia="Consolas" w:hAnsi="Consolas" w:cs="Consolas"/>
+          <w:sz w:val="18"/>
+          <w:szCs w:val="18"/>
+        </w:rPr>
+        <w:t xml:space="preserve"> — geração de feedback e nota sugerida via IA</w:t>
+      </w:r>
+    </w:p>
+    <w:p>
+      <w:pPr>
+        <w:shd w:val="clear" w:color="auto" w:fill="F2F2F2"/>
+        <w:spacing w:after="40"/>
+      </w:pPr>
+      <w:r>
+        <w:rPr>
+          <w:rFonts w:ascii="Consolas" w:eastAsia="Consolas" w:hAnsi="Consolas" w:cs="Consolas"/>
+          <w:sz w:val="18"/>
+          <w:szCs w:val="18"/>
+        </w:rPr>
+        <w:t xml:space="preserve">    ├── notas — atribuição e consulta de notas</w:t>
+      </w:r>
+    </w:p>
+    <w:p>
+      <w:pPr>
+        <w:shd w:val="clear" w:color="auto" w:fill="F2F2F2"/>
+        <w:spacing w:after="40"/>
+      </w:pPr>
+      <w:r>
+        <w:rPr>
+          <w:rFonts w:ascii="Consolas" w:eastAsia="Consolas" w:hAnsi="Consolas" w:cs="Consolas"/>
+          <w:sz w:val="18"/>
+          <w:szCs w:val="18"/>
+        </w:rPr>
+        <w:t xml:space="preserve">    ├── </w:t>
+      </w:r>
+      <w:proofErr w:type="spellStart"/>
+      <w:r>
+        <w:rPr>
+          <w:rFonts w:ascii="Consolas" w:eastAsia="Consolas" w:hAnsi="Consolas" w:cs="Consolas"/>
+          <w:sz w:val="18"/>
+          <w:szCs w:val="18"/>
+        </w:rPr>
+        <w:t>gamificacao</w:t>
+      </w:r>
+      <w:proofErr w:type="spellEnd"/>
+      <w:r>
+        <w:rPr>
+          <w:rFonts w:ascii="Consolas" w:eastAsia="Consolas" w:hAnsi="Consolas" w:cs="Consolas"/>
+          <w:sz w:val="18"/>
+          <w:szCs w:val="18"/>
+        </w:rPr>
+        <w:t xml:space="preserve"> — motor de regras de XP</w:t>
+      </w:r>
+    </w:p>
+    <w:p>
+      <w:pPr>
+        <w:shd w:val="clear" w:color="auto" w:fill="F2F2F2"/>
+        <w:spacing w:after="40"/>
+      </w:pPr>
+      <w:r>
+        <w:rPr>
+          <w:rFonts w:ascii="Consolas" w:eastAsia="Consolas" w:hAnsi="Consolas" w:cs="Consolas"/>
+          <w:sz w:val="18"/>
+          <w:szCs w:val="18"/>
+        </w:rPr>
+        <w:t xml:space="preserve">    ├── fazenda — </w:t>
+      </w:r>
+      <w:proofErr w:type="spellStart"/>
+      <w:proofErr w:type="gramStart"/>
+      <w:r>
+        <w:rPr>
+          <w:rFonts w:ascii="Consolas" w:eastAsia="Consolas" w:hAnsi="Consolas" w:cs="Consolas"/>
+          <w:sz w:val="18"/>
+          <w:szCs w:val="18"/>
+        </w:rPr>
+        <w:t>mini-jogo</w:t>
+      </w:r>
+      <w:proofErr w:type="spellEnd"/>
+      <w:proofErr w:type="gramEnd"/>
+      <w:r>
+        <w:rPr>
+          <w:rFonts w:ascii="Consolas" w:eastAsia="Consolas" w:hAnsi="Consolas" w:cs="Consolas"/>
+          <w:sz w:val="18"/>
+          <w:szCs w:val="18"/>
+        </w:rPr>
+        <w:t xml:space="preserve"> e seus estados visuais</w:t>
+      </w:r>
+    </w:p>
+    <w:p>
+      <w:pPr>
+        <w:shd w:val="clear" w:color="auto" w:fill="F2F2F2"/>
+        <w:spacing w:after="40"/>
+      </w:pPr>
+      <w:r>
+        <w:rPr>
+          <w:rFonts w:ascii="Consolas" w:eastAsia="Consolas" w:hAnsi="Consolas" w:cs="Consolas"/>
+          <w:sz w:val="18"/>
+          <w:szCs w:val="18"/>
+        </w:rPr>
+        <w:t xml:space="preserve">    ├── </w:t>
+      </w:r>
+      <w:proofErr w:type="spellStart"/>
+      <w:r>
+        <w:rPr>
+          <w:rFonts w:ascii="Consolas" w:eastAsia="Consolas" w:hAnsi="Consolas" w:cs="Consolas"/>
+          <w:sz w:val="18"/>
+          <w:szCs w:val="18"/>
+        </w:rPr>
+        <w:t>notificacoes</w:t>
+      </w:r>
+      <w:proofErr w:type="spellEnd"/>
+      <w:r>
+        <w:rPr>
+          <w:rFonts w:ascii="Consolas" w:eastAsia="Consolas" w:hAnsi="Consolas" w:cs="Consolas"/>
+          <w:sz w:val="18"/>
+          <w:szCs w:val="18"/>
+        </w:rPr>
+        <w:t xml:space="preserve"> — avisos de atividade pendente/nota</w:t>
       </w:r>
     </w:p>
     <w:p>
@@ -1120,7 +1334,63 @@
         <w:spacing w:after="120"/>
       </w:pPr>
       <w:r>
-        <w:t>A execução de atividades de código é delegada ao Judge0 (open-source), que isola cada submissão via namespaces e cgroups do Linux, com limite de tempo de CPU, memória e sem acesso à rede. Pode ser self-hosted via Docker (recomendado em servidor dedicado, já que os containers rodam em modo privileged) ou usado via API hospedada (RapidAPI, com tier gratuito). Suporta PHP e mais de 60 linguagens.</w:t>
+        <w:t>A execução de atividades de código é delegada ao Judge0 (open-</w:t>
+      </w:r>
+      <w:proofErr w:type="spellStart"/>
+      <w:r>
+        <w:t>source</w:t>
+      </w:r>
+      <w:proofErr w:type="spellEnd"/>
+      <w:r>
+        <w:t xml:space="preserve">), que isola cada submissão via </w:t>
+      </w:r>
+      <w:proofErr w:type="spellStart"/>
+      <w:r>
+        <w:t>namespaces</w:t>
+      </w:r>
+      <w:proofErr w:type="spellEnd"/>
+      <w:r>
+        <w:t xml:space="preserve"> e </w:t>
+      </w:r>
+      <w:proofErr w:type="spellStart"/>
+      <w:r>
+        <w:t>cgroups</w:t>
+      </w:r>
+      <w:proofErr w:type="spellEnd"/>
+      <w:r>
+        <w:t xml:space="preserve"> do Linux, com limite de tempo de CPU, memória e sem acesso à rede. Pode ser self-</w:t>
+      </w:r>
+      <w:proofErr w:type="spellStart"/>
+      <w:r>
+        <w:t>hosted</w:t>
+      </w:r>
+      <w:proofErr w:type="spellEnd"/>
+      <w:r>
+        <w:t xml:space="preserve"> via Docker (recomendado em servidor dedicado, já que os containers rodam em modo </w:t>
+      </w:r>
+      <w:proofErr w:type="spellStart"/>
+      <w:r>
+        <w:t>privileged</w:t>
+      </w:r>
+      <w:proofErr w:type="spellEnd"/>
+      <w:r>
+        <w:t>) ou usado via API hospedada (</w:t>
+      </w:r>
+      <w:proofErr w:type="spellStart"/>
+      <w:r>
+        <w:t>RapidAPI</w:t>
+      </w:r>
+      <w:proofErr w:type="spellEnd"/>
+      <w:r>
+        <w:t xml:space="preserve">, com </w:t>
+      </w:r>
+      <w:proofErr w:type="spellStart"/>
+      <w:r>
+        <w:t>tier</w:t>
+      </w:r>
+      <w:proofErr w:type="spellEnd"/>
+      <w:r>
+        <w:t xml:space="preserve"> gratuito). Suporta PHP e mais de 60 linguagens.</w:t>
       </w:r>
     </w:p>
     <w:p>
@@ -1137,7 +1407,23 @@
         <w:spacing w:after="120"/>
       </w:pPr>
       <w:r>
-        <w:t>Feedback e nota sugerida gerados por um modelo de linguagem local (Llama 3.1 8B via Ollama), mantendo os dados dos alunos no próprio servidor. O processamento local funciona em fila (não em paralelo), por isso o feedback é tratado como assíncrono. Uma API paga (ex.: Gemini Flash) fica disponível como plano B para dias de pico ou caso o hardware local não seja suficiente.</w:t>
+        <w:t>Feedback e nota sugerida gerados por um modelo de linguagem local (</w:t>
+      </w:r>
+      <w:proofErr w:type="spellStart"/>
+      <w:r>
+        <w:t>Llama</w:t>
+      </w:r>
+      <w:proofErr w:type="spellEnd"/>
+      <w:r>
+        <w:t xml:space="preserve"> 3.1 8B via </w:t>
+      </w:r>
+      <w:proofErr w:type="spellStart"/>
+      <w:r>
+        <w:t>Ollama</w:t>
+      </w:r>
+      <w:proofErr w:type="spellEnd"/>
+      <w:r>
+        <w:t>), mantendo os dados dos alunos no próprio servidor. O processamento local funciona em fila (não em paralelo), por isso o feedback é tratado como assíncrono. Uma API paga (ex.: Gemini Flash) fica disponível como plano B para dias de pico ou caso o hardware local não seja suficiente.</w:t>
       </w:r>
     </w:p>
     <w:p>
@@ -1233,12 +1519,21 @@
         </w:numPr>
         <w:spacing w:after="100"/>
       </w:pPr>
-      <w:r>
-        <w:rPr>
-          <w:b/>
-          <w:bCs/>
-        </w:rPr>
-        <w:t xml:space="preserve">Usuario: </w:t>
+      <w:proofErr w:type="spellStart"/>
+      <w:r>
+        <w:rPr>
+          <w:b/>
+          <w:bCs/>
+        </w:rPr>
+        <w:t>Usuario</w:t>
+      </w:r>
+      <w:proofErr w:type="spellEnd"/>
+      <w:r>
+        <w:rPr>
+          <w:b/>
+          <w:bCs/>
+        </w:rPr>
+        <w:t xml:space="preserve">: </w:t>
       </w:r>
       <w:r>
         <w:t>base de autenticação para Instrutor e Aluno.</w:t>
@@ -1278,7 +1573,23 @@
           <w:b/>
           <w:bCs/>
         </w:rPr>
-        <w:t xml:space="preserve">Atividade / Submissao: </w:t>
+        <w:t xml:space="preserve">Atividade / </w:t>
+      </w:r>
+      <w:proofErr w:type="spellStart"/>
+      <w:r>
+        <w:rPr>
+          <w:b/>
+          <w:bCs/>
+        </w:rPr>
+        <w:t>Submissao</w:t>
+      </w:r>
+      <w:proofErr w:type="spellEnd"/>
+      <w:r>
+        <w:rPr>
+          <w:b/>
+          <w:bCs/>
+        </w:rPr>
+        <w:t xml:space="preserve">: </w:t>
       </w:r>
       <w:r>
         <w:t>cada atividade recebe várias submissões (uma por aluno/tentativa), cada uma com sua própria nota e feedback.</w:t>
@@ -1293,12 +1604,21 @@
         </w:numPr>
         <w:spacing w:after="100"/>
       </w:pPr>
-      <w:r>
-        <w:rPr>
-          <w:b/>
-          <w:bCs/>
-        </w:rPr>
-        <w:t xml:space="preserve">FeedbackIA / Nota: </w:t>
+      <w:proofErr w:type="spellStart"/>
+      <w:r>
+        <w:rPr>
+          <w:b/>
+          <w:bCs/>
+        </w:rPr>
+        <w:t>FeedbackIA</w:t>
+      </w:r>
+      <w:proofErr w:type="spellEnd"/>
+      <w:r>
+        <w:rPr>
+          <w:b/>
+          <w:bCs/>
+        </w:rPr>
+        <w:t xml:space="preserve"> / Nota: </w:t>
       </w:r>
       <w:r>
         <w:t>gerados a partir de uma submissão; a nota da IA é sugestão até validação do instrutor.</w:t>
@@ -1318,7 +1638,39 @@
           <w:b/>
           <w:bCs/>
         </w:rPr>
-        <w:t xml:space="preserve">Fazenda / ElementoFazenda / XPLog: </w:t>
+        <w:t xml:space="preserve">Fazenda / </w:t>
+      </w:r>
+      <w:proofErr w:type="spellStart"/>
+      <w:r>
+        <w:rPr>
+          <w:b/>
+          <w:bCs/>
+        </w:rPr>
+        <w:t>ElementoFazenda</w:t>
+      </w:r>
+      <w:proofErr w:type="spellEnd"/>
+      <w:r>
+        <w:rPr>
+          <w:b/>
+          <w:bCs/>
+        </w:rPr>
+        <w:t xml:space="preserve"> / </w:t>
+      </w:r>
+      <w:proofErr w:type="spellStart"/>
+      <w:r>
+        <w:rPr>
+          <w:b/>
+          <w:bCs/>
+        </w:rPr>
+        <w:t>XPLog</w:t>
+      </w:r>
+      <w:proofErr w:type="spellEnd"/>
+      <w:r>
+        <w:rPr>
+          <w:b/>
+          <w:bCs/>
+        </w:rPr>
+        <w:t xml:space="preserve">: </w:t>
       </w:r>
       <w:r>
         <w:t>representam a gamificação — o estado da fazenda e seus elementos evoluem conforme o XP acumulado pelo aluno.</w:t>
@@ -1345,6 +1697,9 @@
         <w:jc w:val="center"/>
       </w:pPr>
       <w:r>
+        <w:rPr>
+          <w:noProof/>
+        </w:rPr>
         <w:drawing>
           <wp:inline distT="0" distB="0" distL="0" distR="0" wp14:anchorId="6477EADD" wp14:editId="56834616">
             <wp:extent cx="5731510" cy="6510655"/>
@@ -1456,12 +1811,6 @@
         <w:gridCol w:w="4200"/>
       </w:tblGrid>
       <w:tr>
-        <w:tblPrEx>
-          <w:tblCellMar>
-            <w:top w:w="0" w:type="dxa"/>
-            <w:bottom w:w="0" w:type="dxa"/>
-          </w:tblCellMar>
-        </w:tblPrEx>
         <w:tc>
           <w:tcPr>
             <w:tcW w:w="3200" w:type="dxa"/>
@@ -1512,12 +1861,6 @@
         </w:tc>
       </w:tr>
       <w:tr>
-        <w:tblPrEx>
-          <w:tblCellMar>
-            <w:top w:w="0" w:type="dxa"/>
-            <w:bottom w:w="0" w:type="dxa"/>
-          </w:tblCellMar>
-        </w:tblPrEx>
         <w:tc>
           <w:tcPr>
             <w:tcW w:w="3200" w:type="dxa"/>
@@ -1550,12 +1893,6 @@
         </w:tc>
       </w:tr>
       <w:tr>
-        <w:tblPrEx>
-          <w:tblCellMar>
-            <w:top w:w="0" w:type="dxa"/>
-            <w:bottom w:w="0" w:type="dxa"/>
-          </w:tblCellMar>
-        </w:tblPrEx>
         <w:tc>
           <w:tcPr>
             <w:tcW w:w="3200" w:type="dxa"/>
@@ -1588,12 +1925,6 @@
         </w:tc>
       </w:tr>
       <w:tr>
-        <w:tblPrEx>
-          <w:tblCellMar>
-            <w:top w:w="0" w:type="dxa"/>
-            <w:bottom w:w="0" w:type="dxa"/>
-          </w:tblCellMar>
-        </w:tblPrEx>
         <w:tc>
           <w:tcPr>
             <w:tcW w:w="3200" w:type="dxa"/>
@@ -1620,7 +1951,15 @@
           </w:tcPr>
           <w:p>
             <w:r>
-              <w:t>Envia nova tentativa após o feedback, dentro do prazo definido pelo instrutor (&lt;&lt;extend&gt;&gt; de Realizar Atividades).</w:t>
+              <w:t>Envia nova tentativa após o feedback, dentro do prazo definido pelo instrutor (&lt;&lt;</w:t>
+            </w:r>
+            <w:proofErr w:type="spellStart"/>
+            <w:r>
+              <w:t>extend</w:t>
+            </w:r>
+            <w:proofErr w:type="spellEnd"/>
+            <w:r>
+              <w:t>&gt;&gt; de Realizar Atividades).</w:t>
             </w:r>
           </w:p>
         </w:tc>
@@ -1734,7 +2073,15 @@
         <w:spacing w:after="120"/>
       </w:pPr>
       <w:r>
-        <w:t>Paleta, tipografia e componentes extraídos do protótipo em Figma (arquivo com acesso completo). O sistema já diferencia visualmente os dois perfis mantendo a mesma estrutura: verde para o aluno, azul para o instrutor.</w:t>
+        <w:t xml:space="preserve">Paleta, tipografia e componentes extraídos do protótipo em </w:t>
+      </w:r>
+      <w:proofErr w:type="spellStart"/>
+      <w:r>
+        <w:t>Figma</w:t>
+      </w:r>
+      <w:proofErr w:type="spellEnd"/>
+      <w:r>
+        <w:t xml:space="preserve"> (arquivo com acesso completo). O sistema já diferencia visualmente os dois perfis mantendo a mesma estrutura: verde para o aluno, azul para o instrutor.</w:t>
       </w:r>
     </w:p>
     <w:p>
@@ -1892,12 +2239,6 @@
         <w:gridCol w:w="6700"/>
       </w:tblGrid>
       <w:tr>
-        <w:tblPrEx>
-          <w:tblCellMar>
-            <w:top w:w="0" w:type="dxa"/>
-            <w:bottom w:w="0" w:type="dxa"/>
-          </w:tblCellMar>
-        </w:tblPrEx>
         <w:tc>
           <w:tcPr>
             <w:tcW w:w="900" w:type="dxa"/>
@@ -1920,6 +2261,7 @@
             <w:shd w:val="clear" w:color="auto" w:fill="2C3E50"/>
           </w:tcPr>
           <w:p>
+            <w:proofErr w:type="spellStart"/>
             <w:r>
               <w:rPr>
                 <w:b/>
@@ -1928,6 +2270,7 @@
               </w:rPr>
               <w:t>Hex</w:t>
             </w:r>
+            <w:proofErr w:type="spellEnd"/>
           </w:p>
         </w:tc>
         <w:tc>
@@ -1948,12 +2291,6 @@
         </w:tc>
       </w:tr>
       <w:tr>
-        <w:tblPrEx>
-          <w:tblCellMar>
-            <w:top w:w="0" w:type="dxa"/>
-            <w:bottom w:w="0" w:type="dxa"/>
-          </w:tblCellMar>
-        </w:tblPrEx>
         <w:tc>
           <w:tcPr>
             <w:tcW w:w="900" w:type="dxa"/>
@@ -1967,7 +2304,10 @@
           </w:tcPr>
           <w:p>
             <w:r>
-              <w:t>#34C759</w:t>
+              <w:t>#</w:t>
+            </w:r>
+            <w:r>
+              <w:t>1B5E20</w:t>
             </w:r>
           </w:p>
         </w:tc>
@@ -1983,12 +2323,6 @@
         </w:tc>
       </w:tr>
       <w:tr>
-        <w:tblPrEx>
-          <w:tblCellMar>
-            <w:top w:w="0" w:type="dxa"/>
-            <w:bottom w:w="0" w:type="dxa"/>
-          </w:tblCellMar>
-        </w:tblPrEx>
         <w:tc>
           <w:tcPr>
             <w:tcW w:w="900" w:type="dxa"/>
@@ -2018,12 +2352,6 @@
         </w:tc>
       </w:tr>
       <w:tr>
-        <w:tblPrEx>
-          <w:tblCellMar>
-            <w:top w:w="0" w:type="dxa"/>
-            <w:bottom w:w="0" w:type="dxa"/>
-          </w:tblCellMar>
-        </w:tblPrEx>
         <w:tc>
           <w:tcPr>
             <w:tcW w:w="900" w:type="dxa"/>
@@ -2090,12 +2418,6 @@
         <w:gridCol w:w="6700"/>
       </w:tblGrid>
       <w:tr>
-        <w:tblPrEx>
-          <w:tblCellMar>
-            <w:top w:w="0" w:type="dxa"/>
-            <w:bottom w:w="0" w:type="dxa"/>
-          </w:tblCellMar>
-        </w:tblPrEx>
         <w:tc>
           <w:tcPr>
             <w:tcW w:w="900" w:type="dxa"/>
@@ -2118,6 +2440,7 @@
             <w:shd w:val="clear" w:color="auto" w:fill="2C3E50"/>
           </w:tcPr>
           <w:p>
+            <w:proofErr w:type="spellStart"/>
             <w:r>
               <w:rPr>
                 <w:b/>
@@ -2126,6 +2449,7 @@
               </w:rPr>
               <w:t>Hex</w:t>
             </w:r>
+            <w:proofErr w:type="spellEnd"/>
           </w:p>
         </w:tc>
         <w:tc>
@@ -2146,12 +2470,6 @@
         </w:tc>
       </w:tr>
       <w:tr>
-        <w:tblPrEx>
-          <w:tblCellMar>
-            <w:top w:w="0" w:type="dxa"/>
-            <w:bottom w:w="0" w:type="dxa"/>
-          </w:tblCellMar>
-        </w:tblPrEx>
         <w:tc>
           <w:tcPr>
             <w:tcW w:w="900" w:type="dxa"/>
@@ -2181,12 +2499,6 @@
         </w:tc>
       </w:tr>
       <w:tr>
-        <w:tblPrEx>
-          <w:tblCellMar>
-            <w:top w:w="0" w:type="dxa"/>
-            <w:bottom w:w="0" w:type="dxa"/>
-          </w:tblCellMar>
-        </w:tblPrEx>
         <w:tc>
           <w:tcPr>
             <w:tcW w:w="900" w:type="dxa"/>
@@ -2216,12 +2528,6 @@
         </w:tc>
       </w:tr>
       <w:tr>
-        <w:tblPrEx>
-          <w:tblCellMar>
-            <w:top w:w="0" w:type="dxa"/>
-            <w:bottom w:w="0" w:type="dxa"/>
-          </w:tblCellMar>
-        </w:tblPrEx>
         <w:tc>
           <w:tcPr>
             <w:tcW w:w="900" w:type="dxa"/>
@@ -2288,12 +2594,6 @@
         <w:gridCol w:w="6700"/>
       </w:tblGrid>
       <w:tr>
-        <w:tblPrEx>
-          <w:tblCellMar>
-            <w:top w:w="0" w:type="dxa"/>
-            <w:bottom w:w="0" w:type="dxa"/>
-          </w:tblCellMar>
-        </w:tblPrEx>
         <w:tc>
           <w:tcPr>
             <w:tcW w:w="900" w:type="dxa"/>
@@ -2316,6 +2616,7 @@
             <w:shd w:val="clear" w:color="auto" w:fill="2C3E50"/>
           </w:tcPr>
           <w:p>
+            <w:proofErr w:type="spellStart"/>
             <w:r>
               <w:rPr>
                 <w:b/>
@@ -2324,6 +2625,7 @@
               </w:rPr>
               <w:t>Hex</w:t>
             </w:r>
+            <w:proofErr w:type="spellEnd"/>
           </w:p>
         </w:tc>
         <w:tc>
@@ -2344,12 +2646,6 @@
         </w:tc>
       </w:tr>
       <w:tr>
-        <w:tblPrEx>
-          <w:tblCellMar>
-            <w:top w:w="0" w:type="dxa"/>
-            <w:bottom w:w="0" w:type="dxa"/>
-          </w:tblCellMar>
-        </w:tblPrEx>
         <w:tc>
           <w:tcPr>
             <w:tcW w:w="900" w:type="dxa"/>
@@ -2373,8 +2669,13 @@
           </w:tcPr>
           <w:p>
             <w:r>
-              <w:t>Laranja — botão "Escrever Código", barra de progresso, brilho sob os headers</w:t>
-            </w:r>
+              <w:t xml:space="preserve">Laranja — botão "Escrever Código", barra de progresso, brilho sob os </w:t>
+            </w:r>
+            <w:proofErr w:type="spellStart"/>
+            <w:r>
+              <w:t>headers</w:t>
+            </w:r>
+            <w:proofErr w:type="spellEnd"/>
           </w:p>
         </w:tc>
       </w:tr>
@@ -2416,12 +2717,6 @@
         <w:gridCol w:w="6700"/>
       </w:tblGrid>
       <w:tr>
-        <w:tblPrEx>
-          <w:tblCellMar>
-            <w:top w:w="0" w:type="dxa"/>
-            <w:bottom w:w="0" w:type="dxa"/>
-          </w:tblCellMar>
-        </w:tblPrEx>
         <w:tc>
           <w:tcPr>
             <w:tcW w:w="900" w:type="dxa"/>
@@ -2444,6 +2739,7 @@
             <w:shd w:val="clear" w:color="auto" w:fill="2C3E50"/>
           </w:tcPr>
           <w:p>
+            <w:proofErr w:type="spellStart"/>
             <w:r>
               <w:rPr>
                 <w:b/>
@@ -2452,6 +2748,7 @@
               </w:rPr>
               <w:t>Hex</w:t>
             </w:r>
+            <w:proofErr w:type="spellEnd"/>
           </w:p>
         </w:tc>
         <w:tc>
@@ -2472,12 +2769,6 @@
         </w:tc>
       </w:tr>
       <w:tr>
-        <w:tblPrEx>
-          <w:tblCellMar>
-            <w:top w:w="0" w:type="dxa"/>
-            <w:bottom w:w="0" w:type="dxa"/>
-          </w:tblCellMar>
-        </w:tblPrEx>
         <w:tc>
           <w:tcPr>
             <w:tcW w:w="900" w:type="dxa"/>
@@ -2507,12 +2798,6 @@
         </w:tc>
       </w:tr>
       <w:tr>
-        <w:tblPrEx>
-          <w:tblCellMar>
-            <w:top w:w="0" w:type="dxa"/>
-            <w:bottom w:w="0" w:type="dxa"/>
-          </w:tblCellMar>
-        </w:tblPrEx>
         <w:tc>
           <w:tcPr>
             <w:tcW w:w="900" w:type="dxa"/>
@@ -2542,12 +2827,6 @@
         </w:tc>
       </w:tr>
       <w:tr>
-        <w:tblPrEx>
-          <w:tblCellMar>
-            <w:top w:w="0" w:type="dxa"/>
-            <w:bottom w:w="0" w:type="dxa"/>
-          </w:tblCellMar>
-        </w:tblPrEx>
         <w:tc>
           <w:tcPr>
             <w:tcW w:w="900" w:type="dxa"/>
@@ -2577,12 +2856,6 @@
         </w:tc>
       </w:tr>
       <w:tr>
-        <w:tblPrEx>
-          <w:tblCellMar>
-            <w:top w:w="0" w:type="dxa"/>
-            <w:bottom w:w="0" w:type="dxa"/>
-          </w:tblCellMar>
-        </w:tblPrEx>
         <w:tc>
           <w:tcPr>
             <w:tcW w:w="900" w:type="dxa"/>
@@ -2612,12 +2885,6 @@
         </w:tc>
       </w:tr>
       <w:tr>
-        <w:tblPrEx>
-          <w:tblCellMar>
-            <w:top w:w="0" w:type="dxa"/>
-            <w:bottom w:w="0" w:type="dxa"/>
-          </w:tblCellMar>
-        </w:tblPrEx>
         <w:tc>
           <w:tcPr>
             <w:tcW w:w="900" w:type="dxa"/>
@@ -2641,18 +2908,20 @@
           </w:tcPr>
           <w:p>
             <w:r>
-              <w:t>Texto secundário / labels inativas</w:t>
+              <w:t xml:space="preserve">Texto secundário / </w:t>
+            </w:r>
+            <w:proofErr w:type="spellStart"/>
+            <w:r>
+              <w:t>labels</w:t>
+            </w:r>
+            <w:proofErr w:type="spellEnd"/>
+            <w:r>
+              <w:t xml:space="preserve"> inativas</w:t>
             </w:r>
           </w:p>
         </w:tc>
       </w:tr>
       <w:tr>
-        <w:tblPrEx>
-          <w:tblCellMar>
-            <w:top w:w="0" w:type="dxa"/>
-            <w:bottom w:w="0" w:type="dxa"/>
-          </w:tblCellMar>
-        </w:tblPrEx>
         <w:tc>
           <w:tcPr>
             <w:tcW w:w="900" w:type="dxa"/>
@@ -2701,7 +2970,31 @@
         <w:spacing w:after="120"/>
       </w:pPr>
       <w:r>
-        <w:t>Poppins para chrome/títulos, Inter para conteúdo/feedback. Atenção: os tamanhos no Figma (36–64px) refletem um canvas de desktop grande e precisam ser reduzidos proporcionalmente na implementação real.</w:t>
+        <w:t xml:space="preserve">Poppins para </w:t>
+      </w:r>
+      <w:proofErr w:type="spellStart"/>
+      <w:r>
+        <w:t>chrome</w:t>
+      </w:r>
+      <w:proofErr w:type="spellEnd"/>
+      <w:r>
+        <w:t xml:space="preserve">/títulos, Inter para conteúdo/feedback. Atenção: os tamanhos no </w:t>
+      </w:r>
+      <w:proofErr w:type="spellStart"/>
+      <w:r>
+        <w:t>Figma</w:t>
+      </w:r>
+      <w:proofErr w:type="spellEnd"/>
+      <w:r>
+        <w:t xml:space="preserve"> (36–64px) refletem um </w:t>
+      </w:r>
+      <w:proofErr w:type="spellStart"/>
+      <w:r>
+        <w:t>canvas</w:t>
+      </w:r>
+      <w:proofErr w:type="spellEnd"/>
+      <w:r>
+        <w:t xml:space="preserve"> de desktop grande e precisam ser reduzidos proporcionalmente na implementação real.</w:t>
       </w:r>
     </w:p>
     <w:tbl>
@@ -2726,12 +3019,6 @@
         <w:gridCol w:w="6000"/>
       </w:tblGrid>
       <w:tr>
-        <w:tblPrEx>
-          <w:tblCellMar>
-            <w:top w:w="0" w:type="dxa"/>
-            <w:bottom w:w="0" w:type="dxa"/>
-          </w:tblCellMar>
-        </w:tblPrEx>
         <w:tc>
           <w:tcPr>
             <w:tcW w:w="3000" w:type="dxa"/>
@@ -2766,12 +3053,6 @@
         </w:tc>
       </w:tr>
       <w:tr>
-        <w:tblPrEx>
-          <w:tblCellMar>
-            <w:top w:w="0" w:type="dxa"/>
-            <w:bottom w:w="0" w:type="dxa"/>
-          </w:tblCellMar>
-        </w:tblPrEx>
         <w:tc>
           <w:tcPr>
             <w:tcW w:w="3000" w:type="dxa"/>
@@ -2794,20 +3075,19 @@
         </w:tc>
       </w:tr>
       <w:tr>
-        <w:tblPrEx>
-          <w:tblCellMar>
-            <w:top w:w="0" w:type="dxa"/>
-            <w:bottom w:w="0" w:type="dxa"/>
-          </w:tblCellMar>
-        </w:tblPrEx>
         <w:tc>
           <w:tcPr>
             <w:tcW w:w="3000" w:type="dxa"/>
           </w:tcPr>
           <w:p>
             <w:r>
-              <w:t>Poppins — Medium</w:t>
-            </w:r>
+              <w:t xml:space="preserve">Poppins — </w:t>
+            </w:r>
+            <w:proofErr w:type="spellStart"/>
+            <w:r>
+              <w:t>Medium</w:t>
+            </w:r>
+            <w:proofErr w:type="spellEnd"/>
           </w:p>
         </w:tc>
         <w:tc>
@@ -2822,12 +3102,6 @@
         </w:tc>
       </w:tr>
       <w:tr>
-        <w:tblPrEx>
-          <w:tblCellMar>
-            <w:top w:w="0" w:type="dxa"/>
-            <w:bottom w:w="0" w:type="dxa"/>
-          </w:tblCellMar>
-        </w:tblPrEx>
         <w:tc>
           <w:tcPr>
             <w:tcW w:w="3000" w:type="dxa"/>
@@ -2850,12 +3124,6 @@
         </w:tc>
       </w:tr>
       <w:tr>
-        <w:tblPrEx>
-          <w:tblCellMar>
-            <w:top w:w="0" w:type="dxa"/>
-            <w:bottom w:w="0" w:type="dxa"/>
-          </w:tblCellMar>
-        </w:tblPrEx>
         <w:tc>
           <w:tcPr>
             <w:tcW w:w="3000" w:type="dxa"/>
@@ -2884,8 +3152,13 @@
         <w:spacing w:before="220" w:after="100"/>
       </w:pPr>
       <w:r>
-        <w:t>Border-radius</w:t>
-      </w:r>
+        <w:t>Border-</w:t>
+      </w:r>
+      <w:proofErr w:type="spellStart"/>
+      <w:r>
+        <w:t>radius</w:t>
+      </w:r>
+      <w:proofErr w:type="spellEnd"/>
     </w:p>
     <w:tbl>
       <w:tblPr>
@@ -2909,12 +3182,6 @@
         <w:gridCol w:w="7000"/>
       </w:tblGrid>
       <w:tr>
-        <w:tblPrEx>
-          <w:tblCellMar>
-            <w:top w:w="0" w:type="dxa"/>
-            <w:bottom w:w="0" w:type="dxa"/>
-          </w:tblCellMar>
-        </w:tblPrEx>
         <w:tc>
           <w:tcPr>
             <w:tcW w:w="2000" w:type="dxa"/>
@@ -2949,12 +3216,6 @@
         </w:tc>
       </w:tr>
       <w:tr>
-        <w:tblPrEx>
-          <w:tblCellMar>
-            <w:top w:w="0" w:type="dxa"/>
-            <w:bottom w:w="0" w:type="dxa"/>
-          </w:tblCellMar>
-        </w:tblPrEx>
         <w:tc>
           <w:tcPr>
             <w:tcW w:w="2000" w:type="dxa"/>
@@ -2977,12 +3238,6 @@
         </w:tc>
       </w:tr>
       <w:tr>
-        <w:tblPrEx>
-          <w:tblCellMar>
-            <w:top w:w="0" w:type="dxa"/>
-            <w:bottom w:w="0" w:type="dxa"/>
-          </w:tblCellMar>
-        </w:tblPrEx>
         <w:tc>
           <w:tcPr>
             <w:tcW w:w="2000" w:type="dxa"/>
@@ -3005,12 +3260,6 @@
         </w:tc>
       </w:tr>
       <w:tr>
-        <w:tblPrEx>
-          <w:tblCellMar>
-            <w:top w:w="0" w:type="dxa"/>
-            <w:bottom w:w="0" w:type="dxa"/>
-          </w:tblCellMar>
-        </w:tblPrEx>
         <w:tc>
           <w:tcPr>
             <w:tcW w:w="2000" w:type="dxa"/>
@@ -3033,12 +3282,6 @@
         </w:tc>
       </w:tr>
       <w:tr>
-        <w:tblPrEx>
-          <w:tblCellMar>
-            <w:top w:w="0" w:type="dxa"/>
-            <w:bottom w:w="0" w:type="dxa"/>
-          </w:tblCellMar>
-        </w:tblPrEx>
         <w:tc>
           <w:tcPr>
             <w:tcW w:w="2000" w:type="dxa"/>
@@ -3061,12 +3304,6 @@
         </w:tc>
       </w:tr>
       <w:tr>
-        <w:tblPrEx>
-          <w:tblCellMar>
-            <w:top w:w="0" w:type="dxa"/>
-            <w:bottom w:w="0" w:type="dxa"/>
-          </w:tblCellMar>
-        </w:tblPrEx>
         <w:tc>
           <w:tcPr>
             <w:tcW w:w="2000" w:type="dxa"/>
@@ -3089,12 +3326,6 @@
         </w:tc>
       </w:tr>
       <w:tr>
-        <w:tblPrEx>
-          <w:tblCellMar>
-            <w:top w:w="0" w:type="dxa"/>
-            <w:bottom w:w="0" w:type="dxa"/>
-          </w:tblCellMar>
-        </w:tblPrEx>
         <w:tc>
           <w:tcPr>
             <w:tcW w:w="2000" w:type="dxa"/>
@@ -3117,12 +3348,6 @@
         </w:tc>
       </w:tr>
       <w:tr>
-        <w:tblPrEx>
-          <w:tblCellMar>
-            <w:top w:w="0" w:type="dxa"/>
-            <w:bottom w:w="0" w:type="dxa"/>
-          </w:tblCellMar>
-        </w:tblPrEx>
         <w:tc>
           <w:tcPr>
             <w:tcW w:w="2000" w:type="dxa"/>
@@ -3139,18 +3364,20 @@
           </w:tcPr>
           <w:p>
             <w:r>
-              <w:t>Balão de feedback da IA (chat bubble)</w:t>
+              <w:t xml:space="preserve">Balão de feedback da IA (chat </w:t>
+            </w:r>
+            <w:proofErr w:type="spellStart"/>
+            <w:r>
+              <w:t>bubble</w:t>
+            </w:r>
+            <w:proofErr w:type="spellEnd"/>
+            <w:r>
+              <w:t>)</w:t>
             </w:r>
           </w:p>
         </w:tc>
       </w:tr>
       <w:tr>
-        <w:tblPrEx>
-          <w:tblCellMar>
-            <w:top w:w="0" w:type="dxa"/>
-            <w:bottom w:w="0" w:type="dxa"/>
-          </w:tblCellMar>
-        </w:tblPrEx>
         <w:tc>
           <w:tcPr>
             <w:tcW w:w="2000" w:type="dxa"/>
@@ -3199,7 +3426,15 @@
         <w:t xml:space="preserve">Barra superior (header): </w:t>
       </w:r>
       <w:r>
-        <w:t>Faixa colorida de ponta a ponta (verde no aluno, azul no instrutor), logo circular + "The Farm Edu" à esquerda, avatar do usuário à direita.</w:t>
+        <w:t xml:space="preserve">Faixa colorida de ponta a ponta (verde no aluno, azul no instrutor), logo circular + "The </w:t>
+      </w:r>
+      <w:proofErr w:type="spellStart"/>
+      <w:r>
+        <w:t>Farm</w:t>
+      </w:r>
+      <w:proofErr w:type="spellEnd"/>
+      <w:r>
+        <w:t xml:space="preserve"> Edu" à esquerda, avatar do usuário à direita.</w:t>
       </w:r>
     </w:p>
     <w:p>
@@ -3239,7 +3474,15 @@
         <w:t xml:space="preserve">Cards de matéria/atividade: </w:t>
       </w:r>
       <w:r>
-        <w:t>Barra de título colorida (verde) com texto preto em bold, levemente rotacionado (~-0.35°) — efeito "colado à mão", proposital.</w:t>
+        <w:t xml:space="preserve">Barra de título colorida (verde) com texto preto em </w:t>
+      </w:r>
+      <w:proofErr w:type="spellStart"/>
+      <w:r>
+        <w:t>bold</w:t>
+      </w:r>
+      <w:proofErr w:type="spellEnd"/>
+      <w:r>
+        <w:t>, levemente rotacionado (~-0.35°) — efeito "colado à mão", proposital.</w:t>
       </w:r>
     </w:p>
     <w:p>
@@ -3259,7 +3502,23 @@
         <w:t xml:space="preserve">Feed / Mural: </w:t>
       </w:r>
       <w:r>
-        <w:t>Itens em formato de pílula longa; o mais recente vem com borda verde de destaque. Título em bold, timestamp com opacidade reduzida (75%).</w:t>
+        <w:t xml:space="preserve">Itens em formato de pílula longa; o mais recente vem com borda verde de destaque. Título em </w:t>
+      </w:r>
+      <w:proofErr w:type="spellStart"/>
+      <w:r>
+        <w:t>bold</w:t>
+      </w:r>
+      <w:proofErr w:type="spellEnd"/>
+      <w:r>
+        <w:t xml:space="preserve">, </w:t>
+      </w:r>
+      <w:proofErr w:type="spellStart"/>
+      <w:r>
+        <w:t>timestamp</w:t>
+      </w:r>
+      <w:proofErr w:type="spellEnd"/>
+      <w:r>
+        <w:t xml:space="preserve"> com opacidade reduzida (75%).</w:t>
       </w:r>
     </w:p>
     <w:p>
@@ -3279,7 +3538,15 @@
         <w:t xml:space="preserve">Botões: </w:t>
       </w:r>
       <w:r>
-        <w:t>Formato pílula, preenchimento sólido (verde para ação primária do aluno, laranja para "escrever código"), texto branco em bold.</w:t>
+        <w:t xml:space="preserve">Formato pílula, preenchimento sólido (verde para ação primária do aluno, laranja para "escrever código"), texto branco em </w:t>
+      </w:r>
+      <w:proofErr w:type="spellStart"/>
+      <w:r>
+        <w:t>bold</w:t>
+      </w:r>
+      <w:proofErr w:type="spellEnd"/>
+      <w:r>
+        <w:t>.</w:t>
       </w:r>
     </w:p>
     <w:p>
@@ -3316,7 +3583,15 @@
         <w:spacing w:after="120"/>
       </w:pPr>
       <w:r>
-        <w:t>Baseado em protótipo de aluno (acesso apenas de visualização); aproveitar a mecânica, não o estilo visual (pixel art), que será substituído pela linguagem acima (cards arredondados, Poppins, paleta verde/azul):</w:t>
+        <w:t xml:space="preserve">Baseado em protótipo de aluno (acesso apenas de visualização); aproveitar a mecânica, não o estilo visual (pixel </w:t>
+      </w:r>
+      <w:proofErr w:type="spellStart"/>
+      <w:r>
+        <w:t>art</w:t>
+      </w:r>
+      <w:proofErr w:type="spellEnd"/>
+      <w:r>
+        <w:t>), que será substituído pela linguagem acima (cards arredondados, Poppins, paleta verde/azul):</w:t>
       </w:r>
     </w:p>
     <w:p>
@@ -3395,7 +3670,31 @@
         <w:spacing w:after="120"/>
       </w:pPr>
       <w:r>
-        <w:t>56 alunos (21 manhã + 35 tarde), organizados em squads de 3-4 pessoas, cada um dono de um módulo (seção 5.2) ponta a ponta — sem separação fixa por camada. Tech leads rotativos (2-3 alunos por sprint) revisam Pull Requests junto ao instrutor.</w:t>
+        <w:t xml:space="preserve">56 alunos (21 manhã + 35 tarde), organizados em </w:t>
+      </w:r>
+      <w:proofErr w:type="spellStart"/>
+      <w:r>
+        <w:t>squads</w:t>
+      </w:r>
+      <w:proofErr w:type="spellEnd"/>
+      <w:r>
+        <w:t xml:space="preserve"> de 3-4 pessoas, cada um dono de um módulo (seção 5.2) ponta a ponta — sem separação fixa por camada. Tech leads rotativos (2-3 alunos por sprint) revisam </w:t>
+      </w:r>
+      <w:proofErr w:type="spellStart"/>
+      <w:r>
+        <w:t>Pull</w:t>
+      </w:r>
+      <w:proofErr w:type="spellEnd"/>
+      <w:r>
+        <w:t xml:space="preserve"> </w:t>
+      </w:r>
+      <w:proofErr w:type="spellStart"/>
+      <w:r>
+        <w:t>Requests</w:t>
+      </w:r>
+      <w:proofErr w:type="spellEnd"/>
+      <w:r>
+        <w:t xml:space="preserve"> junto ao instrutor.</w:t>
       </w:r>
     </w:p>
     <w:p>
@@ -3424,7 +3723,15 @@
         <w:t xml:space="preserve">Repositório: </w:t>
       </w:r>
       <w:r>
-        <w:t>uma organização e um repositório monorepo no GitHub.</w:t>
+        <w:t xml:space="preserve">uma organização e um repositório </w:t>
+      </w:r>
+      <w:proofErr w:type="spellStart"/>
+      <w:r>
+        <w:t>monorepo</w:t>
+      </w:r>
+      <w:proofErr w:type="spellEnd"/>
+      <w:r>
+        <w:t xml:space="preserve"> no GitHub.</w:t>
       </w:r>
     </w:p>
     <w:p>
@@ -3444,27 +3751,96 @@
         <w:t xml:space="preserve">Gestão de tarefas: </w:t>
       </w:r>
       <w:r>
-        <w:t>GitHub Issues + GitHub Projects (kanban) — usado no lugar do Jira, cujo plano gratuito cobre só até 10 usuários.</w:t>
-      </w:r>
-    </w:p>
-    <w:p>
-      <w:pPr>
-        <w:pStyle w:val="PargrafodaLista"/>
-        <w:numPr>
-          <w:ilvl w:val="0"/>
-          <w:numId w:val="2"/>
-        </w:numPr>
-        <w:spacing w:after="100"/>
-      </w:pPr>
-      <w:r>
-        <w:rPr>
-          <w:b/>
-          <w:bCs/>
-        </w:rPr>
-        <w:t xml:space="preserve">Branch protection: </w:t>
-      </w:r>
-      <w:r>
-        <w:t>main protegida; todo código entra via Pull Request revisado.</w:t>
+        <w:t xml:space="preserve">GitHub </w:t>
+      </w:r>
+      <w:proofErr w:type="spellStart"/>
+      <w:r>
+        <w:t>Issues</w:t>
+      </w:r>
+      <w:proofErr w:type="spellEnd"/>
+      <w:r>
+        <w:t xml:space="preserve"> + GitHub </w:t>
+      </w:r>
+      <w:proofErr w:type="spellStart"/>
+      <w:r>
+        <w:t>Projects</w:t>
+      </w:r>
+      <w:proofErr w:type="spellEnd"/>
+      <w:r>
+        <w:t xml:space="preserve"> (</w:t>
+      </w:r>
+      <w:proofErr w:type="spellStart"/>
+      <w:r>
+        <w:t>kanban</w:t>
+      </w:r>
+      <w:proofErr w:type="spellEnd"/>
+      <w:r>
+        <w:t xml:space="preserve">) — usado no lugar do </w:t>
+      </w:r>
+      <w:proofErr w:type="spellStart"/>
+      <w:r>
+        <w:t>Jira</w:t>
+      </w:r>
+      <w:proofErr w:type="spellEnd"/>
+      <w:r>
+        <w:t>, cujo plano gratuito cobre só até 10 usuários.</w:t>
+      </w:r>
+    </w:p>
+    <w:p>
+      <w:pPr>
+        <w:pStyle w:val="PargrafodaLista"/>
+        <w:numPr>
+          <w:ilvl w:val="0"/>
+          <w:numId w:val="2"/>
+        </w:numPr>
+        <w:spacing w:after="100"/>
+      </w:pPr>
+      <w:r>
+        <w:rPr>
+          <w:b/>
+          <w:bCs/>
+        </w:rPr>
+        <w:t xml:space="preserve">Branch </w:t>
+      </w:r>
+      <w:proofErr w:type="spellStart"/>
+      <w:r>
+        <w:rPr>
+          <w:b/>
+          <w:bCs/>
+        </w:rPr>
+        <w:t>protection</w:t>
+      </w:r>
+      <w:proofErr w:type="spellEnd"/>
+      <w:r>
+        <w:rPr>
+          <w:b/>
+          <w:bCs/>
+        </w:rPr>
+        <w:t xml:space="preserve">: </w:t>
+      </w:r>
+      <w:proofErr w:type="spellStart"/>
+      <w:r>
+        <w:t>main</w:t>
+      </w:r>
+      <w:proofErr w:type="spellEnd"/>
+      <w:r>
+        <w:t xml:space="preserve"> protegida; todo código entra via </w:t>
+      </w:r>
+      <w:proofErr w:type="spellStart"/>
+      <w:r>
+        <w:t>Pull</w:t>
+      </w:r>
+      <w:proofErr w:type="spellEnd"/>
+      <w:r>
+        <w:t xml:space="preserve"> </w:t>
+      </w:r>
+      <w:proofErr w:type="spellStart"/>
+      <w:r>
+        <w:t>Request</w:t>
+      </w:r>
+      <w:proofErr w:type="spellEnd"/>
+      <w:r>
+        <w:t xml:space="preserve"> revisado.</w:t>
       </w:r>
     </w:p>
     <w:p>
@@ -3484,7 +3860,23 @@
         <w:t xml:space="preserve">Integração entre turmas: </w:t>
       </w:r>
       <w:r>
-        <w:t>assíncrona via PRs, board compartilhado e canal de comunicação único entre squads dependentes.</w:t>
+        <w:t xml:space="preserve">assíncrona via </w:t>
+      </w:r>
+      <w:proofErr w:type="spellStart"/>
+      <w:r>
+        <w:t>PRs</w:t>
+      </w:r>
+      <w:proofErr w:type="spellEnd"/>
+      <w:r>
+        <w:t xml:space="preserve">, board compartilhado e canal de comunicação único entre </w:t>
+      </w:r>
+      <w:proofErr w:type="spellStart"/>
+      <w:r>
+        <w:t>squads</w:t>
+      </w:r>
+      <w:proofErr w:type="spellEnd"/>
+      <w:r>
+        <w:t xml:space="preserve"> dependentes.</w:t>
       </w:r>
     </w:p>
     <w:p>
@@ -3530,12 +3922,6 @@
         <w:gridCol w:w="5500"/>
       </w:tblGrid>
       <w:tr>
-        <w:tblPrEx>
-          <w:tblCellMar>
-            <w:top w:w="0" w:type="dxa"/>
-            <w:bottom w:w="0" w:type="dxa"/>
-          </w:tblCellMar>
-        </w:tblPrEx>
         <w:tc>
           <w:tcPr>
             <w:tcW w:w="2000" w:type="dxa"/>
@@ -3586,12 +3972,6 @@
         </w:tc>
       </w:tr>
       <w:tr>
-        <w:tblPrEx>
-          <w:tblCellMar>
-            <w:top w:w="0" w:type="dxa"/>
-            <w:bottom w:w="0" w:type="dxa"/>
-          </w:tblCellMar>
-        </w:tblPrEx>
         <w:tc>
           <w:tcPr>
             <w:tcW w:w="2000" w:type="dxa"/>
@@ -3621,18 +4001,44 @@
           </w:tcPr>
           <w:p>
             <w:r>
-              <w:t>Apresentação da documentação; ensino de Git/branch/PR; implementação do core; formação dos squads; setup de ambiente; Judge0 e teste de Llama local.</w:t>
+              <w:t xml:space="preserve">Apresentação da documentação; ensino de </w:t>
+            </w:r>
+            <w:proofErr w:type="spellStart"/>
+            <w:r>
+              <w:t>Git</w:t>
+            </w:r>
+            <w:proofErr w:type="spellEnd"/>
+            <w:r>
+              <w:t>/</w:t>
+            </w:r>
+            <w:proofErr w:type="spellStart"/>
+            <w:r>
+              <w:t>branch</w:t>
+            </w:r>
+            <w:proofErr w:type="spellEnd"/>
+            <w:r>
+              <w:t xml:space="preserve">/PR; implementação do core; formação dos </w:t>
+            </w:r>
+            <w:proofErr w:type="spellStart"/>
+            <w:r>
+              <w:t>squads</w:t>
+            </w:r>
+            <w:proofErr w:type="spellEnd"/>
+            <w:r>
+              <w:t xml:space="preserve">; setup de ambiente; Judge0 e teste de </w:t>
+            </w:r>
+            <w:proofErr w:type="spellStart"/>
+            <w:r>
+              <w:t>Llama</w:t>
+            </w:r>
+            <w:proofErr w:type="spellEnd"/>
+            <w:r>
+              <w:t xml:space="preserve"> local.</w:t>
             </w:r>
           </w:p>
         </w:tc>
       </w:tr>
       <w:tr>
-        <w:tblPrEx>
-          <w:tblCellMar>
-            <w:top w:w="0" w:type="dxa"/>
-            <w:bottom w:w="0" w:type="dxa"/>
-          </w:tblCellMar>
-        </w:tblPrEx>
         <w:tc>
           <w:tcPr>
             <w:tcW w:w="2000" w:type="dxa"/>
@@ -3662,18 +4068,28 @@
           </w:tcPr>
           <w:p>
             <w:r>
-              <w:t>Modelagem final do banco; PDO prepared statements; login dos dois perfis; CRUD básico de turmas/cursos.</w:t>
+              <w:t xml:space="preserve">Modelagem final do banco; PDO </w:t>
+            </w:r>
+            <w:proofErr w:type="spellStart"/>
+            <w:r>
+              <w:t>prepared</w:t>
+            </w:r>
+            <w:proofErr w:type="spellEnd"/>
+            <w:r>
+              <w:t xml:space="preserve"> </w:t>
+            </w:r>
+            <w:proofErr w:type="spellStart"/>
+            <w:r>
+              <w:t>statements</w:t>
+            </w:r>
+            <w:proofErr w:type="spellEnd"/>
+            <w:r>
+              <w:t>; login dos dois perfis; CRUD básico de turmas/cursos.</w:t>
             </w:r>
           </w:p>
         </w:tc>
       </w:tr>
       <w:tr>
-        <w:tblPrEx>
-          <w:tblCellMar>
-            <w:top w:w="0" w:type="dxa"/>
-            <w:bottom w:w="0" w:type="dxa"/>
-          </w:tblCellMar>
-        </w:tblPrEx>
         <w:tc>
           <w:tcPr>
             <w:tcW w:w="2000" w:type="dxa"/>
@@ -3709,12 +4125,6 @@
         </w:tc>
       </w:tr>
       <w:tr>
-        <w:tblPrEx>
-          <w:tblCellMar>
-            <w:top w:w="0" w:type="dxa"/>
-            <w:bottom w:w="0" w:type="dxa"/>
-          </w:tblCellMar>
-        </w:tblPrEx>
         <w:tc>
           <w:tcPr>
             <w:tcW w:w="2000" w:type="dxa"/>
@@ -3744,18 +4154,22 @@
           </w:tcPr>
           <w:p>
             <w:r>
-              <w:t>Regras de XP; fazenda como mini-jogo; integração XP → estado da fazenda.</w:t>
+              <w:t xml:space="preserve">Regras de XP; fazenda como </w:t>
+            </w:r>
+            <w:proofErr w:type="spellStart"/>
+            <w:proofErr w:type="gramStart"/>
+            <w:r>
+              <w:t>mini-jogo</w:t>
+            </w:r>
+            <w:proofErr w:type="spellEnd"/>
+            <w:proofErr w:type="gramEnd"/>
+            <w:r>
+              <w:t>; integração XP → estado da fazenda.</w:t>
             </w:r>
           </w:p>
         </w:tc>
       </w:tr>
       <w:tr>
-        <w:tblPrEx>
-          <w:tblCellMar>
-            <w:top w:w="0" w:type="dxa"/>
-            <w:bottom w:w="0" w:type="dxa"/>
-          </w:tblCellMar>
-        </w:tblPrEx>
         <w:tc>
           <w:tcPr>
             <w:tcW w:w="2000" w:type="dxa"/>
@@ -3791,12 +4205,6 @@
         </w:tc>
       </w:tr>
       <w:tr>
-        <w:tblPrEx>
-          <w:tblCellMar>
-            <w:top w:w="0" w:type="dxa"/>
-            <w:bottom w:w="0" w:type="dxa"/>
-          </w:tblCellMar>
-        </w:tblPrEx>
         <w:tc>
           <w:tcPr>
             <w:tcW w:w="2000" w:type="dxa"/>
@@ -3825,8 +4233,21 @@
             <w:tcW w:w="5500" w:type="dxa"/>
           </w:tcPr>
           <w:p>
-            <w:r>
-              <w:t>Deploy; documentação final; apresentação por squad.</w:t>
+            <w:proofErr w:type="spellStart"/>
+            <w:r>
+              <w:t>Deploy</w:t>
+            </w:r>
+            <w:proofErr w:type="spellEnd"/>
+            <w:r>
+              <w:t xml:space="preserve">; documentação final; apresentação por </w:t>
+            </w:r>
+            <w:proofErr w:type="spellStart"/>
+            <w:r>
+              <w:t>squad</w:t>
+            </w:r>
+            <w:proofErr w:type="spellEnd"/>
+            <w:r>
+              <w:t>.</w:t>
             </w:r>
           </w:p>
         </w:tc>
@@ -4539,6 +4960,7 @@
   <w:style w:type="character" w:default="1" w:styleId="Fontepargpadro">
     <w:name w:val="Default Paragraph Font"/>
     <w:uiPriority w:val="1"/>
+    <w:semiHidden/>
     <w:unhideWhenUsed/>
   </w:style>
   <w:style w:type="table" w:default="1" w:styleId="Tabelanormal">

</xml_diff>